<commit_message>
fix: resolve login No static resource error, refine doc 5 and split doc 6 table rows
</commit_message>
<xml_diff>
--- a/docs/03-report/实训文档/23030301曹磊-1/10-答辩记录.docx
+++ b/docs/03-report/实训文档/23030301曹磊-1/10-答辩记录.docx
@@ -1,20 +1,17 @@
 
 <file path=word/document.xml><?xml version="1.0" encoding="utf-8"?>
-<w:document xmlns:a="http://schemas.openxmlformats.org/drawingml/2006/main" xmlns:pic="http://schemas.openxmlformats.org/drawingml/2006/picture" xmlns:wpc="http://schemas.microsoft.com/office/word/2010/wordprocessingCanvas" xmlns:mc="http://schemas.openxmlformats.org/markup-compatibility/2006" xmlns:o="urn:schemas-microsoft-com:office:office" xmlns:r="http://schemas.openxmlformats.org/officeDocument/2006/relationships" xmlns:m="http://schemas.openxmlformats.org/officeDocument/2006/math" xmlns:v="urn:schemas-microsoft-com:vml" xmlns:wp14="http://schemas.microsoft.com/office/word/2010/wordprocessingDrawing" xmlns:wp="http://schemas.openxmlformats.org/drawingml/2006/wordprocessingDrawing" xmlns:w="http://schemas.openxmlformats.org/wordprocessingml/2006/main" xmlns:w14="http://schemas.microsoft.com/office/word/2010/wordml" xmlns:w10="urn:schemas-microsoft-com:office:word" xmlns:w15="http://schemas.microsoft.com/office/word/2012/wordml" xmlns:wpg="http://schemas.microsoft.com/office/word/2010/wordprocessingGroup" xmlns:wpi="http://schemas.microsoft.com/office/word/2010/wordprocessingInk" xmlns:wne="http://schemas.microsoft.com/office/word/2006/wordml" xmlns:wps="http://schemas.microsoft.com/office/word/2010/wordprocessingShape" xmlns:wpsCustomData="http://www.wps.cn/officeDocument/2013/wpsCustomData" mc:Ignorable="w14 w15 wp14">
+<w:document xmlns:wpc="http://schemas.microsoft.com/office/word/2010/wordprocessingCanvas" xmlns:cx="http://schemas.microsoft.com/office/drawing/2014/chartex" xmlns:cx1="http://schemas.microsoft.com/office/drawing/2015/9/8/chartex" xmlns:cx2="http://schemas.microsoft.com/office/drawing/2015/10/21/chartex" xmlns:cx3="http://schemas.microsoft.com/office/drawing/2016/5/9/chartex" xmlns:cx4="http://schemas.microsoft.com/office/drawing/2016/5/10/chartex" xmlns:cx5="http://schemas.microsoft.com/office/drawing/2016/5/11/chartex" xmlns:cx6="http://schemas.microsoft.com/office/drawing/2016/5/12/chartex" xmlns:cx7="http://schemas.microsoft.com/office/drawing/2016/5/13/chartex" xmlns:cx8="http://schemas.microsoft.com/office/drawing/2016/5/14/chartex" xmlns:mc="http://schemas.openxmlformats.org/markup-compatibility/2006" xmlns:aink="http://schemas.microsoft.com/office/drawing/2016/ink" xmlns:am3d="http://schemas.microsoft.com/office/drawing/2017/model3d" xmlns:o="urn:schemas-microsoft-com:office:office" xmlns:oel="http://schemas.microsoft.com/office/2019/extlst" xmlns:r="http://schemas.openxmlformats.org/officeDocument/2006/relationships" xmlns:m="http://schemas.openxmlformats.org/officeDocument/2006/math" xmlns:v="urn:schemas-microsoft-com:vml" xmlns:wp14="http://schemas.microsoft.com/office/word/2010/wordprocessingDrawing" xmlns:wp="http://schemas.openxmlformats.org/drawingml/2006/wordprocessingDrawing" xmlns:w10="urn:schemas-microsoft-com:office:word" xmlns:w="http://schemas.openxmlformats.org/wordprocessingml/2006/main" xmlns:w14="http://schemas.microsoft.com/office/word/2010/wordml" xmlns:w15="http://schemas.microsoft.com/office/word/2012/wordml" xmlns:w16cex="http://schemas.microsoft.com/office/word/2018/wordml/cex" xmlns:w16cid="http://schemas.microsoft.com/office/word/2016/wordml/cid" xmlns:w16="http://schemas.microsoft.com/office/word/2018/wordml" xmlns:w16du="http://schemas.microsoft.com/office/word/2023/wordml/word16du" xmlns:w16sdtdh="http://schemas.microsoft.com/office/word/2020/wordml/sdtdatahash" xmlns:w16sdtfl="http://schemas.microsoft.com/office/word/2024/wordml/sdtformatlock" xmlns:w16se="http://schemas.microsoft.com/office/word/2015/wordml/symex" xmlns:wpg="http://schemas.microsoft.com/office/word/2010/wordprocessingGroup" xmlns:wpi="http://schemas.microsoft.com/office/word/2010/wordprocessingInk" xmlns:wne="http://schemas.microsoft.com/office/word/2006/wordml" xmlns:wps="http://schemas.microsoft.com/office/word/2010/wordprocessingShape" mc:Ignorable="w14 w15 w16se w16cid w16 w16cex w16sdtdh w16sdtfl w16du wp14">
   <w:body>
     <w:p>
       <w:pPr>
         <w:spacing w:line="360" w:lineRule="auto"/>
         <w:jc w:val="center"/>
-        <w:rPr>
-          <w:rFonts w:hint="eastAsia"/>
-        </w:rPr>
       </w:pPr>
       <w:r>
         <w:fldChar w:fldCharType="begin"/>
       </w:r>
       <w:r>
-        <w:instrText xml:space="preserve">ADDIN CNKISM.UserStyle</w:instrText>
+        <w:instrText>ADDIN CNKISM.UserStyle</w:instrText>
       </w:r>
       <w:r>
         <w:fldChar w:fldCharType="separate"/>
@@ -23,8 +20,11 @@
         <w:fldChar w:fldCharType="end"/>
       </w:r>
       <w:r>
+        <w:rPr>
+          <w:noProof/>
+        </w:rPr>
         <w:drawing>
-          <wp:inline distT="0" distB="0" distL="114300" distR="114300">
+          <wp:inline distT="0" distB="0" distL="114300" distR="114300" wp14:anchorId="2F540BE7" wp14:editId="465972B6">
             <wp:extent cx="2628900" cy="455295"/>
             <wp:effectExtent l="0" t="0" r="0" b="1905"/>
             <wp:docPr id="1" name="图片 1" descr="HWOCRTEMP_ROC00"/>
@@ -72,9 +72,6 @@
       <w:pPr>
         <w:spacing w:line="360" w:lineRule="auto"/>
         <w:jc w:val="center"/>
-        <w:rPr>
-          <w:rFonts w:hint="eastAsia"/>
-        </w:rPr>
       </w:pPr>
     </w:p>
     <w:p>
@@ -82,7 +79,6 @@
         <w:spacing w:line="360" w:lineRule="auto"/>
         <w:jc w:val="center"/>
         <w:rPr>
-          <w:rFonts w:hint="eastAsia"/>
           <w:b/>
           <w:sz w:val="32"/>
           <w:szCs w:val="32"/>
@@ -103,9 +99,8 @@
           <w:sz w:val="32"/>
           <w:szCs w:val="32"/>
           <w:u w:val="single"/>
-          <w:lang w:val="en-US" w:eastAsia="zh-CN"/>
         </w:rPr>
-        <w:t>工程项目训练</w:t>
+        <w:t>工程项目训练（</w:t>
       </w:r>
       <w:r>
         <w:rPr>
@@ -114,7 +109,25 @@
           <w:szCs w:val="32"/>
           <w:u w:val="single"/>
         </w:rPr>
-        <w:t xml:space="preserve">（Q）  </w:t>
+        <w:t>Q</w:t>
+      </w:r>
+      <w:r>
+        <w:rPr>
+          <w:rFonts w:hint="eastAsia"/>
+          <w:sz w:val="32"/>
+          <w:szCs w:val="32"/>
+          <w:u w:val="single"/>
+        </w:rPr>
+        <w:t>）</w:t>
+      </w:r>
+      <w:r>
+        <w:rPr>
+          <w:rFonts w:hint="eastAsia"/>
+          <w:sz w:val="32"/>
+          <w:szCs w:val="32"/>
+          <w:u w:val="single"/>
+        </w:rPr>
+        <w:t xml:space="preserve">  </w:t>
       </w:r>
       <w:r>
         <w:rPr>
@@ -128,58 +141,84 @@
     </w:p>
     <w:p>
       <w:pPr>
-        <w:spacing w:before="156" w:beforeLines="50" w:line="360" w:lineRule="auto"/>
-        <w:rPr>
-          <w:rFonts w:hint="eastAsia"/>
-        </w:rPr>
+        <w:spacing w:beforeLines="50" w:before="156" w:line="360" w:lineRule="auto"/>
       </w:pPr>
       <w:r>
         <w:rPr>
-          <w:rFonts w:hint="eastAsia"/>
+          <w:sz w:val="30"/>
         </w:rPr>
-        <w:t xml:space="preserve"/>
+        <w:t>班</w:t>
       </w:r>
       <w:r>
         <w:rPr>
-          <w:rFonts w:ascii="Times New Roman" w:hAnsi="Times New Roman" w:eastAsia="宋体"/>
           <w:sz w:val="30"/>
-          <w:u w:val="none"/>
         </w:rPr>
-        <w:t xml:space="preserve">班    级           </w:t>
+        <w:t xml:space="preserve">    </w:t>
       </w:r>
       <w:r>
         <w:rPr>
-          <w:rFonts w:ascii="Times New Roman" w:hAnsi="Times New Roman" w:eastAsia="宋体"/>
+          <w:sz w:val="30"/>
+        </w:rPr>
+        <w:t>级</w:t>
+      </w:r>
+      <w:r>
+        <w:rPr>
+          <w:sz w:val="30"/>
+        </w:rPr>
+        <w:t xml:space="preserve">           </w:t>
+      </w:r>
+      <w:r>
+        <w:rPr>
           <w:sz w:val="30"/>
           <w:u w:val="single"/>
         </w:rPr>
-        <w:t xml:space="preserve">   23软件一   </w:t>
+        <w:t xml:space="preserve">   23</w:t>
+      </w:r>
+      <w:r>
+        <w:rPr>
+          <w:sz w:val="30"/>
+          <w:u w:val="single"/>
+        </w:rPr>
+        <w:t>软件一</w:t>
+      </w:r>
+      <w:r>
+        <w:rPr>
+          <w:sz w:val="30"/>
+          <w:u w:val="single"/>
+        </w:rPr>
+        <w:t xml:space="preserve">   </w:t>
       </w:r>
     </w:p>
     <w:p>
       <w:pPr>
         <w:spacing w:line="360" w:lineRule="auto"/>
-        <w:rPr>
-          <w:rFonts w:hint="eastAsia"/>
-        </w:rPr>
       </w:pPr>
       <w:r>
         <w:rPr>
-          <w:rFonts w:hint="eastAsia"/>
+          <w:sz w:val="30"/>
         </w:rPr>
-        <w:t xml:space="preserve"/>
+        <w:t>学</w:t>
       </w:r>
       <w:r>
         <w:rPr>
-          <w:rFonts w:ascii="Times New Roman" w:hAnsi="Times New Roman" w:eastAsia="宋体"/>
           <w:sz w:val="30"/>
-          <w:u w:val="none"/>
         </w:rPr>
-        <w:t xml:space="preserve">学    号           </w:t>
+        <w:t xml:space="preserve">    </w:t>
       </w:r>
       <w:r>
         <w:rPr>
-          <w:rFonts w:ascii="Times New Roman" w:hAnsi="Times New Roman" w:eastAsia="宋体"/>
+          <w:sz w:val="30"/>
+        </w:rPr>
+        <w:t>号</w:t>
+      </w:r>
+      <w:r>
+        <w:rPr>
+          <w:sz w:val="30"/>
+        </w:rPr>
+        <w:t xml:space="preserve">           </w:t>
+      </w:r>
+      <w:r>
+        <w:rPr>
           <w:sz w:val="30"/>
           <w:u w:val="single"/>
         </w:rPr>
@@ -188,68 +227,53 @@
     </w:p>
     <w:tbl>
       <w:tblPr>
-        <w:tblStyle w:val="10"/>
         <w:tblW w:w="0" w:type="auto"/>
-        <w:tblInd w:w="0" w:type="dxa"/>
         <w:tblBorders>
-          <w:top w:val="single" w:color="auto" w:sz="4" w:space="0"/>
-          <w:left w:val="single" w:color="auto" w:sz="4" w:space="0"/>
-          <w:bottom w:val="single" w:color="auto" w:sz="4" w:space="0"/>
-          <w:right w:val="single" w:color="auto" w:sz="4" w:space="0"/>
-          <w:insideH w:val="single" w:color="auto" w:sz="4" w:space="0"/>
-          <w:insideV w:val="single" w:color="auto" w:sz="4" w:space="0"/>
+          <w:top w:val="single" w:sz="4" w:space="0" w:color="auto"/>
+          <w:left w:val="single" w:sz="4" w:space="0" w:color="auto"/>
+          <w:bottom w:val="single" w:sz="4" w:space="0" w:color="auto"/>
+          <w:right w:val="single" w:sz="4" w:space="0" w:color="auto"/>
+          <w:insideH w:val="single" w:sz="4" w:space="0" w:color="auto"/>
+          <w:insideV w:val="single" w:sz="4" w:space="0" w:color="auto"/>
         </w:tblBorders>
         <w:tblLayout w:type="fixed"/>
-        <w:tblCellMar>
-          <w:top w:w="0" w:type="dxa"/>
-          <w:left w:w="108" w:type="dxa"/>
-          <w:bottom w:w="0" w:type="dxa"/>
-          <w:right w:w="108" w:type="dxa"/>
-        </w:tblCellMar>
+        <w:tblLook w:val="04A0" w:firstRow="1" w:lastRow="0" w:firstColumn="1" w:lastColumn="0" w:noHBand="0" w:noVBand="1"/>
       </w:tblPr>
       <w:tblGrid>
         <w:gridCol w:w="648"/>
         <w:gridCol w:w="7874"/>
       </w:tblGrid>
       <w:tr>
-        <w:tblPrEx>
-          <w:tblBorders>
-            <w:top w:val="single" w:color="auto" w:sz="4" w:space="0"/>
-            <w:left w:val="single" w:color="auto" w:sz="4" w:space="0"/>
-            <w:bottom w:val="single" w:color="auto" w:sz="4" w:space="0"/>
-            <w:right w:val="single" w:color="auto" w:sz="4" w:space="0"/>
-            <w:insideH w:val="single" w:color="auto" w:sz="4" w:space="0"/>
-            <w:insideV w:val="single" w:color="auto" w:sz="4" w:space="0"/>
-          </w:tblBorders>
-          <w:tblCellMar>
-            <w:top w:w="0" w:type="dxa"/>
-            <w:left w:w="108" w:type="dxa"/>
-            <w:bottom w:w="0" w:type="dxa"/>
-            <w:right w:w="108" w:type="dxa"/>
-          </w:tblCellMar>
-        </w:tblPrEx>
         <w:trPr>
-          <w:trHeight w:val="2870" w:hRule="atLeast"/>
+          <w:trHeight w:val="2870"/>
         </w:trPr>
         <w:tc>
           <w:tcPr>
             <w:tcW w:w="648" w:type="dxa"/>
-            <w:noWrap w:val="0"/>
             <w:vAlign w:val="center"/>
           </w:tcPr>
           <w:p>
             <w:pPr>
               <w:spacing w:line="360" w:lineRule="auto"/>
               <w:jc w:val="center"/>
+            </w:pPr>
+            <w:r>
               <w:rPr>
                 <w:rFonts w:hint="eastAsia"/>
               </w:rPr>
-            </w:pPr>
+              <w:t>专业方向课程设计</w:t>
+            </w:r>
             <w:r>
               <w:rPr>
                 <w:rFonts w:hint="eastAsia"/>
               </w:rPr>
-              <w:t xml:space="preserve">专业方向课程设计  课程答辩情况记录表</w:t>
+              <w:t xml:space="preserve">  </w:t>
+            </w:r>
+            <w:r>
+              <w:rPr>
+                <w:rFonts w:hint="eastAsia"/>
+              </w:rPr>
+              <w:t>课程答辩情况记录表</w:t>
             </w:r>
           </w:p>
           <w:p>
@@ -258,10 +282,57 @@
             </w:pPr>
             <w:r>
               <w:rPr>
-                <w:rFonts w:ascii="Times New Roman" w:hAnsi="Times New Roman" w:eastAsia="宋体"/>
-                <w:sz w:val="24"/>
-              </w:rPr>
-              <w:t xml:space="preserve">二级学院：    计算机信息工程学院        班    级：23软件一</w:t>
+                <w:sz w:val="24"/>
+              </w:rPr>
+              <w:t>二级学院：</w:t>
+            </w:r>
+            <w:r>
+              <w:rPr>
+                <w:sz w:val="24"/>
+              </w:rPr>
+              <w:t xml:space="preserve">    </w:t>
+            </w:r>
+            <w:r>
+              <w:rPr>
+                <w:sz w:val="24"/>
+              </w:rPr>
+              <w:t>计算机信息工程学院</w:t>
+            </w:r>
+            <w:r>
+              <w:rPr>
+                <w:sz w:val="24"/>
+              </w:rPr>
+              <w:t xml:space="preserve">        </w:t>
+            </w:r>
+            <w:r>
+              <w:rPr>
+                <w:sz w:val="24"/>
+              </w:rPr>
+              <w:t>班</w:t>
+            </w:r>
+            <w:r>
+              <w:rPr>
+                <w:sz w:val="24"/>
+              </w:rPr>
+              <w:t xml:space="preserve">    </w:t>
+            </w:r>
+            <w:r>
+              <w:rPr>
+                <w:sz w:val="24"/>
+              </w:rPr>
+              <w:t>级：</w:t>
+            </w:r>
+            <w:r>
+              <w:rPr>
+                <w:sz w:val="24"/>
+              </w:rPr>
+              <w:t>23</w:t>
+            </w:r>
+            <w:r>
+              <w:rPr>
+                <w:sz w:val="24"/>
+              </w:rPr>
+              <w:t>软件一</w:t>
             </w:r>
           </w:p>
           <w:p>
@@ -270,10 +341,64 @@
             </w:pPr>
             <w:r>
               <w:rPr>
-                <w:rFonts w:ascii="Times New Roman" w:hAnsi="Times New Roman" w:eastAsia="宋体"/>
-                <w:sz w:val="24"/>
-              </w:rPr>
-              <w:t xml:space="preserve">学    生：    曹磊                      学    号：23030301</w:t>
+                <w:sz w:val="24"/>
+              </w:rPr>
+              <w:t>学</w:t>
+            </w:r>
+            <w:r>
+              <w:rPr>
+                <w:sz w:val="24"/>
+              </w:rPr>
+              <w:t xml:space="preserve">    </w:t>
+            </w:r>
+            <w:r>
+              <w:rPr>
+                <w:sz w:val="24"/>
+              </w:rPr>
+              <w:lastRenderedPageBreak/>
+              <w:t>生：</w:t>
+            </w:r>
+            <w:r>
+              <w:rPr>
+                <w:sz w:val="24"/>
+              </w:rPr>
+              <w:t xml:space="preserve">    </w:t>
+            </w:r>
+            <w:r>
+              <w:rPr>
+                <w:sz w:val="24"/>
+              </w:rPr>
+              <w:t>曹磊</w:t>
+            </w:r>
+            <w:r>
+              <w:rPr>
+                <w:sz w:val="24"/>
+              </w:rPr>
+              <w:t xml:space="preserve">                      </w:t>
+            </w:r>
+            <w:r>
+              <w:rPr>
+                <w:sz w:val="24"/>
+              </w:rPr>
+              <w:t>学</w:t>
+            </w:r>
+            <w:r>
+              <w:rPr>
+                <w:sz w:val="24"/>
+              </w:rPr>
+              <w:t xml:space="preserve">    </w:t>
+            </w:r>
+            <w:r>
+              <w:rPr>
+                <w:sz w:val="24"/>
+              </w:rPr>
+              <w:t>号：</w:t>
+            </w:r>
+            <w:r>
+              <w:rPr>
+                <w:sz w:val="24"/>
+              </w:rPr>
+              <w:t>23030301</w:t>
             </w:r>
           </w:p>
           <w:p>
@@ -282,10 +407,9 @@
             </w:pPr>
             <w:r>
               <w:rPr>
-                <w:rFonts w:ascii="Times New Roman" w:hAnsi="Times New Roman" w:eastAsia="宋体"/>
-                <w:sz w:val="24"/>
-              </w:rPr>
-              <w:t xml:space="preserve">现场答辩拍照</w:t>
+                <w:sz w:val="24"/>
+              </w:rPr>
+              <w:t>现场答辩拍照</w:t>
             </w:r>
           </w:p>
           <w:p>
@@ -294,10 +418,21 @@
             </w:pPr>
             <w:r>
               <w:rPr>
-                <w:rFonts w:ascii="Times New Roman" w:hAnsi="Times New Roman" w:eastAsia="宋体"/>
-                <w:sz w:val="24"/>
-              </w:rPr>
-              <w:t xml:space="preserve">课题名称：    水果生鲜运营平台</w:t>
+                <w:sz w:val="24"/>
+              </w:rPr>
+              <w:t>课题名称：</w:t>
+            </w:r>
+            <w:r>
+              <w:rPr>
+                <w:sz w:val="24"/>
+              </w:rPr>
+              <w:t xml:space="preserve">    </w:t>
+            </w:r>
+            <w:r>
+              <w:rPr>
+                <w:sz w:val="24"/>
+              </w:rPr>
+              <w:t>水果生鲜运营平台</w:t>
             </w:r>
           </w:p>
           <w:p>
@@ -306,10 +441,9 @@
             </w:pPr>
             <w:r>
               <w:rPr>
-                <w:rFonts w:ascii="Times New Roman" w:hAnsi="Times New Roman" w:eastAsia="宋体"/>
-                <w:sz w:val="24"/>
-              </w:rPr>
-              <w:t xml:space="preserve">答辩情况记录：</w:t>
+                <w:sz w:val="24"/>
+              </w:rPr>
+              <w:t>答辩情况记录：</w:t>
             </w:r>
           </w:p>
           <w:p>
@@ -318,10 +452,52 @@
             </w:pPr>
             <w:r>
               <w:rPr>
-                <w:rFonts w:ascii="Times New Roman" w:hAnsi="Times New Roman" w:eastAsia="宋体"/>
-                <w:sz w:val="24"/>
-              </w:rPr>
-              <w:t xml:space="preserve">问题1：微信小程序端购物车商品数量在首次加载时显示为0或null的竞态问题是如何解决的？</w:t>
+                <w:sz w:val="24"/>
+              </w:rPr>
+              <w:t>问题</w:t>
+            </w:r>
+            <w:r>
+              <w:rPr>
+                <w:sz w:val="24"/>
+              </w:rPr>
+              <w:t>1</w:t>
+            </w:r>
+            <w:r>
+              <w:rPr>
+                <w:sz w:val="24"/>
+              </w:rPr>
+              <w:t>：微信小程序端购物车商品</w:t>
+            </w:r>
+            <w:r>
+              <w:rPr>
+                <w:sz w:val="24"/>
+              </w:rPr>
+              <w:lastRenderedPageBreak/>
+              <w:t>数量在首次加载时显示为</w:t>
+            </w:r>
+            <w:r>
+              <w:rPr>
+                <w:sz w:val="24"/>
+              </w:rPr>
+              <w:t>0</w:t>
+            </w:r>
+            <w:r>
+              <w:rPr>
+                <w:sz w:val="24"/>
+              </w:rPr>
+              <w:t>或</w:t>
+            </w:r>
+            <w:r>
+              <w:rPr>
+                <w:sz w:val="24"/>
+              </w:rPr>
+              <w:t>null</w:t>
+            </w:r>
+            <w:r>
+              <w:rPr>
+                <w:sz w:val="24"/>
+              </w:rPr>
+              <w:t>的竞态问题是如何解决的？</w:t>
             </w:r>
           </w:p>
           <w:p>
@@ -330,10 +506,123 @@
             </w:pPr>
             <w:r>
               <w:rPr>
-                <w:rFonts w:ascii="Times New Roman" w:hAnsi="Times New Roman" w:eastAsia="宋体"/>
-                <w:sz w:val="24"/>
-              </w:rPr>
-              <w:t xml:space="preserve">回答：主要是因为商品列表接口（dish）加载先于购物车列表接口加载。在dishListData的map映射方法中，显式初始化dishNumber为0，并在接收到购物车列表API数据后，动态匹配更新商品列表中的数量，从而修复了orig无法读取动态添加属性导致的null显示。</w:t>
+                <w:sz w:val="24"/>
+              </w:rPr>
+              <w:t>回答：主要是因为商品列表接口（</w:t>
+            </w:r>
+            <w:r>
+              <w:rPr>
+                <w:sz w:val="24"/>
+              </w:rPr>
+              <w:t>dish</w:t>
+            </w:r>
+            <w:r>
+              <w:rPr>
+                <w:sz w:val="24"/>
+              </w:rPr>
+              <w:t>）加载先于购物</w:t>
+            </w:r>
+            <w:r>
+              <w:rPr>
+                <w:sz w:val="24"/>
+              </w:rPr>
+              <w:lastRenderedPageBreak/>
+              <w:t>车列表接口加载。在</w:t>
+            </w:r>
+            <w:proofErr w:type="spellStart"/>
+            <w:r>
+              <w:rPr>
+                <w:sz w:val="24"/>
+              </w:rPr>
+              <w:t>dishListData</w:t>
+            </w:r>
+            <w:proofErr w:type="spellEnd"/>
+            <w:r>
+              <w:rPr>
+                <w:sz w:val="24"/>
+              </w:rPr>
+              <w:t>的</w:t>
+            </w:r>
+            <w:r>
+              <w:rPr>
+                <w:sz w:val="24"/>
+              </w:rPr>
+              <w:t>map</w:t>
+            </w:r>
+            <w:r>
+              <w:rPr>
+                <w:sz w:val="24"/>
+              </w:rPr>
+              <w:t>映射方法中，显式初始化</w:t>
+            </w:r>
+            <w:proofErr w:type="spellStart"/>
+            <w:r>
+              <w:rPr>
+                <w:sz w:val="24"/>
+              </w:rPr>
+              <w:t>dishNumber</w:t>
+            </w:r>
+            <w:proofErr w:type="spellEnd"/>
+            <w:r>
+              <w:rPr>
+                <w:sz w:val="24"/>
+              </w:rPr>
+              <w:t>为</w:t>
+            </w:r>
+            <w:r>
+              <w:rPr>
+                <w:sz w:val="24"/>
+              </w:rPr>
+              <w:t>0</w:t>
+            </w:r>
+            <w:r>
+              <w:rPr>
+                <w:sz w:val="24"/>
+              </w:rPr>
+              <w:t>，并在接收到购物车列表</w:t>
+            </w:r>
+            <w:r>
+              <w:rPr>
+                <w:sz w:val="24"/>
+              </w:rPr>
+              <w:t>API</w:t>
+            </w:r>
+            <w:r>
+              <w:rPr>
+                <w:sz w:val="24"/>
+              </w:rPr>
+              <w:t>数据后，动态匹配</w:t>
+            </w:r>
+            <w:r>
+              <w:rPr>
+                <w:sz w:val="24"/>
+              </w:rPr>
+              <w:lastRenderedPageBreak/>
+              <w:t>更新商品列表中的数量，从而修复了</w:t>
+            </w:r>
+            <w:r>
+              <w:rPr>
+                <w:sz w:val="24"/>
+              </w:rPr>
+              <w:t>orig</w:t>
+            </w:r>
+            <w:r>
+              <w:rPr>
+                <w:sz w:val="24"/>
+              </w:rPr>
+              <w:t>无法读取动态添加属性导致的</w:t>
+            </w:r>
+            <w:r>
+              <w:rPr>
+                <w:sz w:val="24"/>
+              </w:rPr>
+              <w:t>null</w:t>
+            </w:r>
+            <w:r>
+              <w:rPr>
+                <w:sz w:val="24"/>
+              </w:rPr>
+              <w:t>显示。</w:t>
             </w:r>
           </w:p>
           <w:p>
@@ -342,10 +631,28 @@
             </w:pPr>
             <w:r>
               <w:rPr>
-                <w:rFonts w:ascii="Times New Roman" w:hAnsi="Times New Roman" w:eastAsia="宋体"/>
-                <w:sz w:val="24"/>
-              </w:rPr>
-              <w:t xml:space="preserve">问题2：订单下单时，收货地址是如何自动注入并具备回退逻辑的？</w:t>
+                <w:sz w:val="24"/>
+              </w:rPr>
+              <w:t>问题</w:t>
+            </w:r>
+            <w:r>
+              <w:rPr>
+                <w:sz w:val="24"/>
+              </w:rPr>
+              <w:t>2</w:t>
+            </w:r>
+            <w:r>
+              <w:rPr>
+                <w:sz w:val="24"/>
+              </w:rPr>
+              <w:t>：订单下单时，收货地址是如</w:t>
+            </w:r>
+            <w:r>
+              <w:rPr>
+                <w:sz w:val="24"/>
+              </w:rPr>
+              <w:lastRenderedPageBreak/>
+              <w:t>何自动注入并具备回退逻辑的？</w:t>
             </w:r>
           </w:p>
           <w:p>
@@ -354,10 +661,77 @@
             </w:pPr>
             <w:r>
               <w:rPr>
-                <w:rFonts w:ascii="Times New Roman" w:hAnsi="Times New Roman" w:eastAsia="宋体"/>
-                <w:sz w:val="24"/>
-              </w:rPr>
-              <w:t xml:space="preserve">回答：后端getDefault地址的查询逻辑放宽，若无默认地址则回退返回整个地址列表的第一条；前端在请求不到默认地址时，通过getAddressBookDefault中的后备逻辑，调用完整地址簿查询API获取所有地址并填充首条记录，确保用户在下单时能自动匹配有效地址，防止抛出AddressBookBusinessException。</w:t>
+                <w:sz w:val="24"/>
+              </w:rPr>
+              <w:t>回答：后端</w:t>
+            </w:r>
+            <w:proofErr w:type="spellStart"/>
+            <w:r>
+              <w:rPr>
+                <w:sz w:val="24"/>
+              </w:rPr>
+              <w:t>getDefault</w:t>
+            </w:r>
+            <w:proofErr w:type="spellEnd"/>
+            <w:r>
+              <w:rPr>
+                <w:sz w:val="24"/>
+              </w:rPr>
+              <w:t>地址的查询逻辑放宽，若无默认地址则回退返回整个地址列</w:t>
+            </w:r>
+            <w:r>
+              <w:rPr>
+                <w:sz w:val="24"/>
+              </w:rPr>
+              <w:lastRenderedPageBreak/>
+              <w:t>表的第一条；前端在请求不到默认地址时，通过</w:t>
+            </w:r>
+            <w:proofErr w:type="spellStart"/>
+            <w:r>
+              <w:rPr>
+                <w:sz w:val="24"/>
+              </w:rPr>
+              <w:t>getAddressBookDefault</w:t>
+            </w:r>
+            <w:proofErr w:type="spellEnd"/>
+            <w:r>
+              <w:rPr>
+                <w:sz w:val="24"/>
+              </w:rPr>
+              <w:t>中的后备逻辑，调用完整地址簿查询</w:t>
+            </w:r>
+            <w:r>
+              <w:rPr>
+                <w:sz w:val="24"/>
+              </w:rPr>
+              <w:t>API</w:t>
+            </w:r>
+            <w:r>
+              <w:rPr>
+                <w:sz w:val="24"/>
+              </w:rPr>
+              <w:t>获取所有地</w:t>
+            </w:r>
+            <w:r>
+              <w:rPr>
+                <w:sz w:val="24"/>
+              </w:rPr>
+              <w:lastRenderedPageBreak/>
+              <w:t>址并填充首条记录，确保用户在下单时能自动匹配有效地址，防止抛出</w:t>
+            </w:r>
+            <w:proofErr w:type="spellStart"/>
+            <w:r>
+              <w:rPr>
+                <w:sz w:val="24"/>
+              </w:rPr>
+              <w:t>AddressBookBusinessException</w:t>
+            </w:r>
+            <w:proofErr w:type="spellEnd"/>
+            <w:r>
+              <w:rPr>
+                <w:sz w:val="24"/>
+              </w:rPr>
+              <w:t>。</w:t>
             </w:r>
           </w:p>
           <w:p>
@@ -366,10 +740,28 @@
             </w:pPr>
             <w:r>
               <w:rPr>
-                <w:rFonts w:ascii="Times New Roman" w:hAnsi="Times New Roman" w:eastAsia="宋体"/>
-                <w:sz w:val="24"/>
-              </w:rPr>
-              <w:t xml:space="preserve">问题3：系统在本地部署时，如何防止多个微服务进程意外退出或端口冲突？</w:t>
+                <w:sz w:val="24"/>
+              </w:rPr>
+              <w:t>问题</w:t>
+            </w:r>
+            <w:r>
+              <w:rPr>
+                <w:sz w:val="24"/>
+              </w:rPr>
+              <w:t>3</w:t>
+            </w:r>
+            <w:r>
+              <w:rPr>
+                <w:sz w:val="24"/>
+              </w:rPr>
+              <w:t>：系统在本地</w:t>
+            </w:r>
+            <w:r>
+              <w:rPr>
+                <w:sz w:val="24"/>
+              </w:rPr>
+              <w:lastRenderedPageBreak/>
+              <w:t>部署时，如何防止多个微服务进程意外退出或端口冲突？</w:t>
             </w:r>
           </w:p>
           <w:p>
@@ -378,10 +770,111 @@
             </w:pPr>
             <w:r>
               <w:rPr>
-                <w:rFonts w:ascii="Times New Roman" w:hAnsi="Times New Roman" w:eastAsia="宋体"/>
-                <w:sz w:val="24"/>
-              </w:rPr>
-              <w:t xml:space="preserve">回答：引入了PM2进程管理器对lgg-gateway, lgg-business, lgg-pay, lgg-notice等微服务进行长进程托管。通过PM2 ecosystem.config.cjs配置文件指定了应用入口与端口绑定，开启了自动重启和资源监控，确保了本地调试及答辩现场运行的高可靠性。</w:t>
+                <w:sz w:val="24"/>
+              </w:rPr>
+              <w:t>回答：引入了</w:t>
+            </w:r>
+            <w:r>
+              <w:rPr>
+                <w:sz w:val="24"/>
+              </w:rPr>
+              <w:t>PM2</w:t>
+            </w:r>
+            <w:r>
+              <w:rPr>
+                <w:sz w:val="24"/>
+              </w:rPr>
+              <w:t>进程管理器对</w:t>
+            </w:r>
+            <w:proofErr w:type="spellStart"/>
+            <w:r>
+              <w:rPr>
+                <w:sz w:val="24"/>
+              </w:rPr>
+              <w:t>lgg</w:t>
+            </w:r>
+            <w:proofErr w:type="spellEnd"/>
+            <w:r>
+              <w:rPr>
+                <w:sz w:val="24"/>
+              </w:rPr>
+              <w:t xml:space="preserve">-gateway, </w:t>
+            </w:r>
+            <w:proofErr w:type="spellStart"/>
+            <w:r>
+              <w:rPr>
+                <w:sz w:val="24"/>
+              </w:rPr>
+              <w:t>lgg</w:t>
+            </w:r>
+            <w:proofErr w:type="spellEnd"/>
+            <w:r>
+              <w:rPr>
+                <w:sz w:val="24"/>
+              </w:rPr>
+              <w:t xml:space="preserve">-business, </w:t>
+            </w:r>
+            <w:proofErr w:type="spellStart"/>
+            <w:r>
+              <w:rPr>
+                <w:sz w:val="24"/>
+              </w:rPr>
+              <w:t>lgg</w:t>
+            </w:r>
+            <w:proofErr w:type="spellEnd"/>
+            <w:r>
+              <w:rPr>
+                <w:sz w:val="24"/>
+              </w:rPr>
+              <w:t xml:space="preserve">-pay, </w:t>
+            </w:r>
+            <w:proofErr w:type="spellStart"/>
+            <w:r>
+              <w:rPr>
+                <w:sz w:val="24"/>
+              </w:rPr>
+              <w:lastRenderedPageBreak/>
+              <w:t>lgg</w:t>
+            </w:r>
+            <w:proofErr w:type="spellEnd"/>
+            <w:r>
+              <w:rPr>
+                <w:sz w:val="24"/>
+              </w:rPr>
+              <w:t>-notice</w:t>
+            </w:r>
+            <w:r>
+              <w:rPr>
+                <w:sz w:val="24"/>
+              </w:rPr>
+              <w:t>等微服务进行长进程托管。通过</w:t>
+            </w:r>
+            <w:r>
+              <w:rPr>
+                <w:sz w:val="24"/>
+              </w:rPr>
+              <w:t xml:space="preserve">PM2 </w:t>
+            </w:r>
+            <w:proofErr w:type="spellStart"/>
+            <w:r>
+              <w:rPr>
+                <w:sz w:val="24"/>
+              </w:rPr>
+              <w:t>ecosystem.config.cjs</w:t>
+            </w:r>
+            <w:proofErr w:type="spellEnd"/>
+            <w:r>
+              <w:rPr>
+                <w:sz w:val="24"/>
+              </w:rPr>
+              <w:t>配置文件指定了应用入口与端口绑定，开启了自动重启</w:t>
+            </w:r>
+            <w:r>
+              <w:rPr>
+                <w:sz w:val="24"/>
+              </w:rPr>
+              <w:lastRenderedPageBreak/>
+              <w:t>和资源监控，确保了本地调试及答辩现场运行的高可靠性。</w:t>
             </w:r>
           </w:p>
           <w:p>
@@ -390,10 +883,54 @@
             </w:pPr>
             <w:r>
               <w:rPr>
-                <w:rFonts w:ascii="Times New Roman" w:hAnsi="Times New Roman" w:eastAsia="宋体"/>
-                <w:sz w:val="24"/>
-              </w:rPr>
-              <w:t xml:space="preserve">问题4：系统如何利用 OpenFeign 实现同步服务间通信，以及在模拟支付回调中如何执行异常健壮性优化？</w:t>
+                <w:sz w:val="24"/>
+              </w:rPr>
+              <w:t>问题</w:t>
+            </w:r>
+            <w:r>
+              <w:rPr>
+                <w:sz w:val="24"/>
+              </w:rPr>
+              <w:t>4</w:t>
+            </w:r>
+            <w:r>
+              <w:rPr>
+                <w:sz w:val="24"/>
+              </w:rPr>
+              <w:t>：系统如何利用</w:t>
+            </w:r>
+            <w:r>
+              <w:rPr>
+                <w:sz w:val="24"/>
+              </w:rPr>
+              <w:t xml:space="preserve"> </w:t>
+            </w:r>
+            <w:proofErr w:type="spellStart"/>
+            <w:r>
+              <w:rPr>
+                <w:sz w:val="24"/>
+              </w:rPr>
+              <w:t>OpenFeign</w:t>
+            </w:r>
+            <w:proofErr w:type="spellEnd"/>
+            <w:r>
+              <w:rPr>
+                <w:sz w:val="24"/>
+              </w:rPr>
+              <w:t xml:space="preserve"> </w:t>
+            </w:r>
+            <w:r>
+              <w:rPr>
+                <w:sz w:val="24"/>
+              </w:rPr>
+              <w:t>实现同步服务间通信，以</w:t>
+            </w:r>
+            <w:r>
+              <w:rPr>
+                <w:sz w:val="24"/>
+              </w:rPr>
+              <w:lastRenderedPageBreak/>
+              <w:t>及在模拟支付回调中如何执行异常健壮性优化？</w:t>
             </w:r>
           </w:p>
           <w:p>
@@ -402,10 +939,68 @@
             </w:pPr>
             <w:r>
               <w:rPr>
-                <w:rFonts w:ascii="Times New Roman" w:hAnsi="Times New Roman" w:eastAsia="宋体"/>
-                <w:sz w:val="24"/>
-              </w:rPr>
-              <w:t xml:space="preserve">回答：系统在 Feign 客户端的代理和负载均衡基础之上，在核心订单查询中加入了正则匹配兼容查询分支。对于纯数字订单号，将其转换为主键并进行主键查询；对于含字母前缀的非纯数字订单号，则采用多条件分页降级查找，有效规避了类型转换导致的 NumberFormatException 异常，提升了回调链路在各种订单号格式下的稳定性。</w:t>
+                <w:sz w:val="24"/>
+              </w:rPr>
+              <w:t>回答：系统在</w:t>
+            </w:r>
+            <w:r>
+              <w:rPr>
+                <w:sz w:val="24"/>
+              </w:rPr>
+              <w:t xml:space="preserve"> Feign </w:t>
+            </w:r>
+            <w:r>
+              <w:rPr>
+                <w:sz w:val="24"/>
+              </w:rPr>
+              <w:t>客户端的代理和负载均衡基础之上，在核心</w:t>
+            </w:r>
+            <w:r>
+              <w:rPr>
+                <w:sz w:val="24"/>
+              </w:rPr>
+              <w:lastRenderedPageBreak/>
+              <w:t>订单查询中加入了正则匹配兼容查询分支。对于纯数字订单号，将其转换为主键并进行主键查询；对于含字母前</w:t>
+            </w:r>
+            <w:r>
+              <w:rPr>
+                <w:sz w:val="24"/>
+              </w:rPr>
+              <w:lastRenderedPageBreak/>
+              <w:t>缀的非纯数字订单号，则采用多条件分页降级查找，有效规避了类型转换导致的</w:t>
+            </w:r>
+            <w:r>
+              <w:rPr>
+                <w:sz w:val="24"/>
+              </w:rPr>
+              <w:t xml:space="preserve"> </w:t>
+            </w:r>
+            <w:proofErr w:type="spellStart"/>
+            <w:r>
+              <w:rPr>
+                <w:sz w:val="24"/>
+              </w:rPr>
+              <w:t>NumberFormatException</w:t>
+            </w:r>
+            <w:proofErr w:type="spellEnd"/>
+            <w:r>
+              <w:rPr>
+                <w:sz w:val="24"/>
+              </w:rPr>
+              <w:t xml:space="preserve"> </w:t>
+            </w:r>
+            <w:r>
+              <w:rPr>
+                <w:sz w:val="24"/>
+              </w:rPr>
+              <w:t>异常，提升了回</w:t>
+            </w:r>
+            <w:r>
+              <w:rPr>
+                <w:sz w:val="24"/>
+              </w:rPr>
+              <w:lastRenderedPageBreak/>
+              <w:t>调链路在各种订单号格式下的稳定性。</w:t>
             </w:r>
           </w:p>
           <w:p>
@@ -414,10 +1009,21 @@
             </w:pPr>
             <w:r>
               <w:rPr>
-                <w:rFonts w:ascii="Times New Roman" w:hAnsi="Times New Roman" w:eastAsia="宋体"/>
-                <w:sz w:val="24"/>
-              </w:rPr>
-              <w:t xml:space="preserve">问题5：如何设计真实的微信支付收银台改造与商户接入？</w:t>
+                <w:sz w:val="24"/>
+              </w:rPr>
+              <w:t>问题</w:t>
+            </w:r>
+            <w:r>
+              <w:rPr>
+                <w:sz w:val="24"/>
+              </w:rPr>
+              <w:t>5</w:t>
+            </w:r>
+            <w:r>
+              <w:rPr>
+                <w:sz w:val="24"/>
+              </w:rPr>
+              <w:t>：如何设计真实的微信支付收银台改造与商户接入？</w:t>
             </w:r>
           </w:p>
           <w:p>
@@ -426,10 +1032,112 @@
             </w:pPr>
             <w:r>
               <w:rPr>
-                <w:rFonts w:ascii="Times New Roman" w:hAnsi="Times New Roman" w:eastAsia="宋体"/>
-                <w:sz w:val="24"/>
-              </w:rPr>
-              <w:t xml:space="preserve">回答：需要申请真实的商户号与 API V3 证书，重构后端接口以调用微信官方的 JSAPI 统一下单接口来获取 prepay_id，前端利用小程序原生 API wx.requestPayment 拉起收银台，最后在回调接口中通过商户 API 密钥对支付密文进行安全解密与签名验证，以更新订单状态。</w:t>
+                <w:sz w:val="24"/>
+              </w:rPr>
+              <w:t>回答：需要申</w:t>
+            </w:r>
+            <w:r>
+              <w:rPr>
+                <w:sz w:val="24"/>
+              </w:rPr>
+              <w:lastRenderedPageBreak/>
+              <w:t>请真实的商户号与</w:t>
+            </w:r>
+            <w:r>
+              <w:rPr>
+                <w:sz w:val="24"/>
+              </w:rPr>
+              <w:t xml:space="preserve"> API V3 </w:t>
+            </w:r>
+            <w:r>
+              <w:rPr>
+                <w:sz w:val="24"/>
+              </w:rPr>
+              <w:t>证书，重构后端接口以调用微信官方的</w:t>
+            </w:r>
+            <w:r>
+              <w:rPr>
+                <w:sz w:val="24"/>
+              </w:rPr>
+              <w:t xml:space="preserve"> JSAPI </w:t>
+            </w:r>
+            <w:r>
+              <w:rPr>
+                <w:sz w:val="24"/>
+              </w:rPr>
+              <w:t>统一下单接口来获取</w:t>
+            </w:r>
+            <w:r>
+              <w:rPr>
+                <w:sz w:val="24"/>
+              </w:rPr>
+              <w:t xml:space="preserve"> </w:t>
+            </w:r>
+            <w:proofErr w:type="spellStart"/>
+            <w:r>
+              <w:rPr>
+                <w:sz w:val="24"/>
+              </w:rPr>
+              <w:t>prepay_id</w:t>
+            </w:r>
+            <w:proofErr w:type="spellEnd"/>
+            <w:r>
+              <w:rPr>
+                <w:sz w:val="24"/>
+              </w:rPr>
+              <w:t>，前端利用小程</w:t>
+            </w:r>
+            <w:r>
+              <w:rPr>
+                <w:sz w:val="24"/>
+              </w:rPr>
+              <w:lastRenderedPageBreak/>
+              <w:t>序原生</w:t>
+            </w:r>
+            <w:r>
+              <w:rPr>
+                <w:sz w:val="24"/>
+              </w:rPr>
+              <w:t xml:space="preserve"> API </w:t>
+            </w:r>
+            <w:proofErr w:type="spellStart"/>
+            <w:r>
+              <w:rPr>
+                <w:sz w:val="24"/>
+              </w:rPr>
+              <w:t>wx.requestPayment</w:t>
+            </w:r>
+            <w:proofErr w:type="spellEnd"/>
+            <w:r>
+              <w:rPr>
+                <w:sz w:val="24"/>
+              </w:rPr>
+              <w:t xml:space="preserve"> </w:t>
+            </w:r>
+            <w:r>
+              <w:rPr>
+                <w:sz w:val="24"/>
+              </w:rPr>
+              <w:t>拉起收银台，最后在回调接口中通过商户</w:t>
+            </w:r>
+            <w:r>
+              <w:rPr>
+                <w:sz w:val="24"/>
+              </w:rPr>
+              <w:t xml:space="preserve"> API </w:t>
+            </w:r>
+            <w:r>
+              <w:rPr>
+                <w:sz w:val="24"/>
+              </w:rPr>
+              <w:t>密钥对支付密文进行安全解密与签名验证，以</w:t>
+            </w:r>
+            <w:r>
+              <w:rPr>
+                <w:sz w:val="24"/>
+              </w:rPr>
+              <w:lastRenderedPageBreak/>
+              <w:t>更新订单状态。</w:t>
             </w:r>
           </w:p>
           <w:p>
@@ -438,10 +1146,54 @@
             </w:pPr>
             <w:r>
               <w:rPr>
-                <w:rFonts w:ascii="Times New Roman" w:hAnsi="Times New Roman" w:eastAsia="宋体"/>
-                <w:sz w:val="24"/>
-              </w:rPr>
-              <w:t xml:space="preserve">问题6：管理端大屏的销售额、订单量等今日运营指标是如何与后端真实接口对接的，未来如何利用 ECharts 展示商业财务趋势？</w:t>
+                <w:sz w:val="24"/>
+              </w:rPr>
+              <w:t>问题</w:t>
+            </w:r>
+            <w:r>
+              <w:rPr>
+                <w:sz w:val="24"/>
+              </w:rPr>
+              <w:t>6</w:t>
+            </w:r>
+            <w:r>
+              <w:rPr>
+                <w:sz w:val="24"/>
+              </w:rPr>
+              <w:t>：管理端大屏的销售额、订单量等今日运营指标是如何与后端真实接口对接的，未来如何利</w:t>
+            </w:r>
+            <w:r>
+              <w:rPr>
+                <w:sz w:val="24"/>
+              </w:rPr>
+              <w:lastRenderedPageBreak/>
+              <w:t>用</w:t>
+            </w:r>
+            <w:r>
+              <w:rPr>
+                <w:sz w:val="24"/>
+              </w:rPr>
+              <w:t xml:space="preserve"> </w:t>
+            </w:r>
+            <w:proofErr w:type="spellStart"/>
+            <w:r>
+              <w:rPr>
+                <w:sz w:val="24"/>
+              </w:rPr>
+              <w:t>ECharts</w:t>
+            </w:r>
+            <w:proofErr w:type="spellEnd"/>
+            <w:r>
+              <w:rPr>
+                <w:sz w:val="24"/>
+              </w:rPr>
+              <w:t xml:space="preserve"> </w:t>
+            </w:r>
+            <w:r>
+              <w:rPr>
+                <w:sz w:val="24"/>
+              </w:rPr>
+              <w:t>展示商业财务趋势？</w:t>
             </w:r>
           </w:p>
           <w:p>
@@ -450,30 +1202,153 @@
             </w:pPr>
             <w:r>
               <w:rPr>
-                <w:rFonts w:ascii="Times New Roman" w:hAnsi="Times New Roman" w:eastAsia="宋体"/>
-                <w:sz w:val="24"/>
-              </w:rPr>
-              <w:t xml:space="preserve">回答：今日销售额、今日订单量、新增会员、在售商品数分别对接后台 businessData 和 overviewOrders 等真实接口数据。后续将在管理端首页引入 ECharts 折线图、柱状图与饼图，映射最近 7 天营业额走势、热销商品 Top10、订单状态占比以及新增用户数增长趋势等真实 API 接口，实现全动态的数据可视化大屏展现。</w:t>
+                <w:sz w:val="24"/>
+              </w:rPr>
+              <w:t>回答：今日销售额、今日订单量、新增会员、在售商品数分别对接后台</w:t>
+            </w:r>
+            <w:r>
+              <w:rPr>
+                <w:sz w:val="24"/>
+              </w:rPr>
+              <w:t xml:space="preserve"> </w:t>
+            </w:r>
+            <w:proofErr w:type="spellStart"/>
+            <w:r>
+              <w:rPr>
+                <w:sz w:val="24"/>
+              </w:rPr>
+              <w:t>businessData</w:t>
+            </w:r>
+            <w:proofErr w:type="spellEnd"/>
+            <w:r>
+              <w:rPr>
+                <w:sz w:val="24"/>
+              </w:rPr>
+              <w:t xml:space="preserve"> </w:t>
+            </w:r>
+            <w:r>
+              <w:rPr>
+                <w:sz w:val="24"/>
+              </w:rPr>
+              <w:t>和</w:t>
+            </w:r>
+            <w:r>
+              <w:rPr>
+                <w:sz w:val="24"/>
+              </w:rPr>
+              <w:t xml:space="preserve"> </w:t>
+            </w:r>
+            <w:proofErr w:type="spellStart"/>
+            <w:r>
+              <w:rPr>
+                <w:sz w:val="24"/>
+              </w:rPr>
+              <w:t>overvie</w:t>
+            </w:r>
+            <w:r>
+              <w:rPr>
+                <w:sz w:val="24"/>
+              </w:rPr>
+              <w:lastRenderedPageBreak/>
+              <w:t>wOrders</w:t>
+            </w:r>
+            <w:proofErr w:type="spellEnd"/>
+            <w:r>
+              <w:rPr>
+                <w:sz w:val="24"/>
+              </w:rPr>
+              <w:t xml:space="preserve"> </w:t>
+            </w:r>
+            <w:r>
+              <w:rPr>
+                <w:sz w:val="24"/>
+              </w:rPr>
+              <w:t>等真实接口数据。后续将在管理端首页引入</w:t>
+            </w:r>
+            <w:r>
+              <w:rPr>
+                <w:sz w:val="24"/>
+              </w:rPr>
+              <w:t xml:space="preserve"> </w:t>
+            </w:r>
+            <w:proofErr w:type="spellStart"/>
+            <w:r>
+              <w:rPr>
+                <w:sz w:val="24"/>
+              </w:rPr>
+              <w:t>ECharts</w:t>
+            </w:r>
+            <w:proofErr w:type="spellEnd"/>
+            <w:r>
+              <w:rPr>
+                <w:sz w:val="24"/>
+              </w:rPr>
+              <w:t xml:space="preserve"> </w:t>
+            </w:r>
+            <w:r>
+              <w:rPr>
+                <w:sz w:val="24"/>
+              </w:rPr>
+              <w:t>折线图、柱状图与饼图，映射最近</w:t>
+            </w:r>
+            <w:r>
+              <w:rPr>
+                <w:sz w:val="24"/>
+              </w:rPr>
+              <w:t xml:space="preserve"> 7 </w:t>
+            </w:r>
+            <w:r>
+              <w:rPr>
+                <w:sz w:val="24"/>
+              </w:rPr>
+              <w:t>天营业额走势、热销商品</w:t>
+            </w:r>
+            <w:r>
+              <w:rPr>
+                <w:sz w:val="24"/>
+              </w:rPr>
+              <w:t xml:space="preserve"> </w:t>
+            </w:r>
+            <w:r>
+              <w:rPr>
+                <w:sz w:val="24"/>
+              </w:rPr>
+              <w:lastRenderedPageBreak/>
+              <w:t>Top10</w:t>
+            </w:r>
+            <w:r>
+              <w:rPr>
+                <w:sz w:val="24"/>
+              </w:rPr>
+              <w:t>、订单状态占比以及新增用户数增长趋势等真实</w:t>
+            </w:r>
+            <w:r>
+              <w:rPr>
+                <w:sz w:val="24"/>
+              </w:rPr>
+              <w:t xml:space="preserve"> API </w:t>
+            </w:r>
+            <w:r>
+              <w:rPr>
+                <w:sz w:val="24"/>
+              </w:rPr>
+              <w:t>接口，实现全动态的数据可视化大屏展现。</w:t>
             </w:r>
           </w:p>
         </w:tc>
         <w:tc>
           <w:tcPr>
             <w:tcW w:w="7874" w:type="dxa"/>
-            <w:noWrap w:val="0"/>
-            <w:vAlign w:val="top"/>
           </w:tcPr>
           <w:p>
             <w:pPr>
               <w:spacing w:line="360" w:lineRule="auto"/>
               <w:jc w:val="center"/>
               <w:rPr>
-                <w:rFonts w:hint="eastAsia"/>
                 <w:b/>
                 <w:bCs/>
                 <w:sz w:val="28"/>
                 <w:szCs w:val="36"/>
-                <w:highlight w:val="red"/>
               </w:rPr>
             </w:pPr>
             <w:r>
@@ -483,19 +1358,39 @@
                 <w:bCs/>
                 <w:sz w:val="28"/>
                 <w:szCs w:val="36"/>
-                <w:highlight w:val="red"/>
-              </w:rPr>
-              <w:t xml:space="preserve">【常工鲜生微信小程序与微服务运营平台 课程答辩记录】</w:t>
+              </w:rPr>
+              <w:lastRenderedPageBreak/>
+              <w:t>【常工鲜生微信小程序与微服务运营平台</w:t>
+            </w:r>
+            <w:r>
+              <w:rPr>
+                <w:rFonts w:hint="eastAsia"/>
+                <w:b/>
+                <w:bCs/>
+                <w:sz w:val="28"/>
+                <w:szCs w:val="36"/>
+              </w:rPr>
+              <w:t xml:space="preserve"> </w:t>
+            </w:r>
+            <w:r>
+              <w:rPr>
+                <w:rFonts w:hint="eastAsia"/>
+                <w:b/>
+                <w:bCs/>
+                <w:sz w:val="28"/>
+                <w:szCs w:val="36"/>
+              </w:rPr>
+              <w:t>课程答辩记录】</w:t>
             </w:r>
           </w:p>
           <w:p>
             <w:pPr>
               <w:pBdr>
-                <w:bottom w:val="single" w:color="DDDDDD" w:sz="6" w:space="8"/>
+                <w:bottom w:val="single" w:sz="6" w:space="8" w:color="DDDDDD"/>
               </w:pBdr>
               <w:spacing w:line="276" w:lineRule="auto"/>
               <w:rPr>
-                <w:rFonts w:hint="eastAsia" w:ascii="宋体" w:hAnsi="宋体" w:cs="宋体"/>
+                <w:rFonts w:ascii="宋体" w:hAnsi="宋体" w:cs="宋体"/>
                 <w:b/>
                 <w:bCs/>
                 <w:szCs w:val="21"/>
@@ -503,22 +1398,22 @@
             </w:pPr>
             <w:r>
               <w:rPr>
-                <w:rFonts w:hint="eastAsia" w:ascii="宋体" w:hAnsi="宋体" w:cs="宋体"/>
+                <w:rFonts w:ascii="宋体" w:hAnsi="宋体" w:cs="宋体" w:hint="eastAsia"/>
                 <w:b/>
                 <w:bCs/>
                 <w:szCs w:val="21"/>
               </w:rPr>
-              <w:t xml:space="preserve">问题 1：项目微服务架构中，Gateway 网关是如何实现路由分发与统一鉴权的？</w:t>
+              <w:t>问题 1：项目微服务架构中，Gateway 网关是如何实现路由分发与统一鉴权的？</w:t>
             </w:r>
           </w:p>
           <w:p>
             <w:pPr>
               <w:pBdr>
-                <w:bottom w:val="single" w:color="DDDDDD" w:sz="6" w:space="8"/>
+                <w:bottom w:val="single" w:sz="6" w:space="8" w:color="DDDDDD"/>
               </w:pBdr>
               <w:spacing w:line="276" w:lineRule="auto"/>
               <w:rPr>
-                <w:rFonts w:hint="eastAsia" w:ascii="宋体" w:hAnsi="宋体" w:cs="宋体"/>
+                <w:rFonts w:ascii="宋体" w:hAnsi="宋体" w:cs="宋体"/>
                 <w:b/>
                 <w:bCs/>
                 <w:szCs w:val="21"/>
@@ -526,22 +1421,42 @@
             </w:pPr>
             <w:r>
               <w:rPr>
-                <w:rFonts w:hint="eastAsia" w:ascii="宋体" w:hAnsi="宋体" w:cs="宋体"/>
+                <w:rFonts w:ascii="宋体" w:hAnsi="宋体" w:cs="宋体" w:hint="eastAsia"/>
                 <w:b/>
                 <w:bCs/>
                 <w:szCs w:val="21"/>
               </w:rPr>
-              <w:t xml:space="preserve">回答 1：系统通过 Spring Cloud Gateway 统一监听 8090 端口，在配置文件中定义断言谓词转发至后端业务微服务；同时结合全局 JwtAuthenticationTokenFilter 对前端请求头中的 Token 进行合法性校验与跨域放行。</w:t>
+              <w:t xml:space="preserve">回答 1：系统通过 Spring Cloud Gateway 统一监听 8090 端口，在配置文件中定义断言谓词转发至后端业务微服务；同时结合全局 </w:t>
+            </w:r>
+            <w:proofErr w:type="spellStart"/>
+            <w:r>
+              <w:rPr>
+                <w:rFonts w:ascii="宋体" w:hAnsi="宋体" w:cs="宋体" w:hint="eastAsia"/>
+                <w:b/>
+                <w:bCs/>
+                <w:szCs w:val="21"/>
+              </w:rPr>
+              <w:t>JwtAuthenticationTokenFilter</w:t>
+            </w:r>
+            <w:proofErr w:type="spellEnd"/>
+            <w:r>
+              <w:rPr>
+                <w:rFonts w:ascii="宋体" w:hAnsi="宋体" w:cs="宋体" w:hint="eastAsia"/>
+                <w:b/>
+                <w:bCs/>
+                <w:szCs w:val="21"/>
+              </w:rPr>
+              <w:t xml:space="preserve"> 对前端请求头中的 Token 进行合法性校验与跨域放行。</w:t>
             </w:r>
           </w:p>
           <w:p>
             <w:pPr>
               <w:pBdr>
-                <w:bottom w:val="single" w:color="DDDDDD" w:sz="6" w:space="8"/>
+                <w:bottom w:val="single" w:sz="6" w:space="8" w:color="DDDDDD"/>
               </w:pBdr>
               <w:spacing w:line="276" w:lineRule="auto"/>
               <w:rPr>
-                <w:rFonts w:hint="eastAsia" w:ascii="宋体" w:hAnsi="宋体" w:cs="宋体"/>
+                <w:rFonts w:ascii="宋体" w:hAnsi="宋体" w:cs="宋体"/>
                 <w:b/>
                 <w:bCs/>
                 <w:szCs w:val="21"/>
@@ -549,22 +1464,22 @@
             </w:pPr>
             <w:r>
               <w:rPr>
-                <w:rFonts w:hint="eastAsia" w:ascii="宋体" w:hAnsi="宋体" w:cs="宋体"/>
+                <w:rFonts w:ascii="宋体" w:hAnsi="宋体" w:cs="宋体" w:hint="eastAsia"/>
                 <w:b/>
                 <w:bCs/>
                 <w:szCs w:val="21"/>
               </w:rPr>
-              <w:t xml:space="preserve">问题 2：订单支付成功后，系统是如何实现秒级实时推送来单提醒的？</w:t>
+              <w:t>问题 2：订单支付成功后，系统是如何实现秒级实时推送来单提醒的？</w:t>
             </w:r>
           </w:p>
           <w:p>
             <w:pPr>
               <w:pBdr>
-                <w:bottom w:val="single" w:color="DDDDDD" w:sz="6" w:space="8"/>
+                <w:bottom w:val="single" w:sz="6" w:space="8" w:color="DDDDDD"/>
               </w:pBdr>
               <w:spacing w:line="276" w:lineRule="auto"/>
               <w:rPr>
-                <w:rFonts w:hint="eastAsia" w:ascii="宋体" w:hAnsi="宋体" w:cs="宋体"/>
+                <w:rFonts w:ascii="宋体" w:hAnsi="宋体" w:cs="宋体"/>
                 <w:b/>
                 <w:bCs/>
                 <w:szCs w:val="21"/>
@@ -572,22 +1487,62 @@
             </w:pPr>
             <w:r>
               <w:rPr>
-                <w:rFonts w:hint="eastAsia" w:ascii="宋体" w:hAnsi="宋体" w:cs="宋体"/>
+                <w:rFonts w:ascii="宋体" w:hAnsi="宋体" w:cs="宋体" w:hint="eastAsia"/>
                 <w:b/>
                 <w:bCs/>
                 <w:szCs w:val="21"/>
               </w:rPr>
-              <w:t xml:space="preserve">回答 2：当支付服务完成支付逻辑后，主动向 RabbitMQ 交换机投递 pay.success 消息；ruoyi-notice 通知微服务异步消费该消息，并通过 WebSocket 长连接将提醒即时广播推送给前端 Vue 管理后台与小程序端。</w:t>
+              <w:t xml:space="preserve">回答 2：当支付服务完成支付逻辑后，主动向 RabbitMQ 交换机投递 </w:t>
+            </w:r>
+            <w:proofErr w:type="spellStart"/>
+            <w:r>
+              <w:rPr>
+                <w:rFonts w:ascii="宋体" w:hAnsi="宋体" w:cs="宋体" w:hint="eastAsia"/>
+                <w:b/>
+                <w:bCs/>
+                <w:szCs w:val="21"/>
+              </w:rPr>
+              <w:t>pay.success</w:t>
+            </w:r>
+            <w:proofErr w:type="spellEnd"/>
+            <w:r>
+              <w:rPr>
+                <w:rFonts w:ascii="宋体" w:hAnsi="宋体" w:cs="宋体" w:hint="eastAsia"/>
+                <w:b/>
+                <w:bCs/>
+                <w:szCs w:val="21"/>
+              </w:rPr>
+              <w:t xml:space="preserve"> 消息；</w:t>
+            </w:r>
+            <w:proofErr w:type="spellStart"/>
+            <w:r>
+              <w:rPr>
+                <w:rFonts w:ascii="宋体" w:hAnsi="宋体" w:cs="宋体" w:hint="eastAsia"/>
+                <w:b/>
+                <w:bCs/>
+                <w:szCs w:val="21"/>
+              </w:rPr>
+              <w:t>ruoyi</w:t>
+            </w:r>
+            <w:proofErr w:type="spellEnd"/>
+            <w:r>
+              <w:rPr>
+                <w:rFonts w:ascii="宋体" w:hAnsi="宋体" w:cs="宋体" w:hint="eastAsia"/>
+                <w:b/>
+                <w:bCs/>
+                <w:szCs w:val="21"/>
+              </w:rPr>
+              <w:t>-notice 通知微服务异步消费该消息，并通过 WebSocket 长连接将提醒即时广播推送给前端 Vue 管理后台与小程序端。</w:t>
             </w:r>
           </w:p>
           <w:p>
             <w:pPr>
               <w:pBdr>
-                <w:bottom w:val="single" w:color="DDDDDD" w:sz="6" w:space="8"/>
+                <w:bottom w:val="single" w:sz="6" w:space="8" w:color="DDDDDD"/>
               </w:pBdr>
               <w:spacing w:line="276" w:lineRule="auto"/>
               <w:rPr>
-                <w:rFonts w:hint="eastAsia" w:ascii="宋体" w:hAnsi="宋体" w:cs="宋体"/>
+                <w:rFonts w:ascii="宋体" w:hAnsi="宋体" w:cs="宋体"/>
                 <w:b/>
                 <w:bCs/>
                 <w:szCs w:val="21"/>
@@ -595,22 +1550,22 @@
             </w:pPr>
             <w:r>
               <w:rPr>
-                <w:rFonts w:hint="eastAsia" w:ascii="宋体" w:hAnsi="宋体" w:cs="宋体"/>
+                <w:rFonts w:ascii="宋体" w:hAnsi="宋体" w:cs="宋体" w:hint="eastAsia"/>
                 <w:b/>
                 <w:bCs/>
                 <w:szCs w:val="21"/>
               </w:rPr>
-              <w:t xml:space="preserve">问题 3：在部署方面，为什么选择 Docker Compose 容器编排替代传统的直接运行？</w:t>
+              <w:t>问题 3：在部署方面，为什么选择 Docker Compose 容器编排替代传统的直接运行？</w:t>
             </w:r>
           </w:p>
           <w:p>
             <w:pPr>
               <w:pBdr>
-                <w:bottom w:val="single" w:color="DDDDDD" w:sz="6" w:space="8"/>
+                <w:bottom w:val="single" w:sz="6" w:space="8" w:color="DDDDDD"/>
               </w:pBdr>
               <w:spacing w:line="276" w:lineRule="auto"/>
               <w:rPr>
-                <w:rFonts w:hint="eastAsia" w:ascii="宋体" w:hAnsi="宋体" w:cs="宋体"/>
+                <w:rFonts w:ascii="宋体" w:hAnsi="宋体" w:cs="宋体"/>
                 <w:b/>
                 <w:bCs/>
                 <w:szCs w:val="21"/>
@@ -618,36 +1573,88 @@
             </w:pPr>
             <w:r>
               <w:rPr>
-                <w:rFonts w:hint="eastAsia" w:ascii="宋体" w:hAnsi="宋体" w:cs="宋体"/>
+                <w:rFonts w:ascii="宋体" w:hAnsi="宋体" w:cs="宋体" w:hint="eastAsia"/>
                 <w:b/>
                 <w:bCs/>
                 <w:szCs w:val="21"/>
               </w:rPr>
-              <w:t xml:space="preserve">回答 3：项目包含 MySQL、Redis、Nacos、RabbitMQ、MinIO 以及 5 个 Spring Cloud Java 微服务。使用 Docker Compose 可以通过声明式的 yml 脚本进行基础设施一键拉起与服务编排，彻底打通环境一致性，符合现代云原生企业级部署标准。</w:t>
+              <w:t>回答 3：项目包含 MySQL、Redis、</w:t>
+            </w:r>
+            <w:proofErr w:type="spellStart"/>
+            <w:r>
+              <w:rPr>
+                <w:rFonts w:ascii="宋体" w:hAnsi="宋体" w:cs="宋体" w:hint="eastAsia"/>
+                <w:b/>
+                <w:bCs/>
+                <w:szCs w:val="21"/>
+              </w:rPr>
+              <w:t>Nacos</w:t>
+            </w:r>
+            <w:proofErr w:type="spellEnd"/>
+            <w:r>
+              <w:rPr>
+                <w:rFonts w:ascii="宋体" w:hAnsi="宋体" w:cs="宋体" w:hint="eastAsia"/>
+                <w:b/>
+                <w:bCs/>
+                <w:szCs w:val="21"/>
+              </w:rPr>
+              <w:t>、RabbitMQ、</w:t>
+            </w:r>
+            <w:proofErr w:type="spellStart"/>
+            <w:r>
+              <w:rPr>
+                <w:rFonts w:ascii="宋体" w:hAnsi="宋体" w:cs="宋体" w:hint="eastAsia"/>
+                <w:b/>
+                <w:bCs/>
+                <w:szCs w:val="21"/>
+              </w:rPr>
+              <w:t>MinIO</w:t>
+            </w:r>
+            <w:proofErr w:type="spellEnd"/>
+            <w:r>
+              <w:rPr>
+                <w:rFonts w:ascii="宋体" w:hAnsi="宋体" w:cs="宋体" w:hint="eastAsia"/>
+                <w:b/>
+                <w:bCs/>
+                <w:szCs w:val="21"/>
+              </w:rPr>
+              <w:t xml:space="preserve"> 以及 5 个 Spring Cloud Java 微服务。使用 Docker Compose 可以通过声明式的 </w:t>
+            </w:r>
+            <w:proofErr w:type="spellStart"/>
+            <w:r>
+              <w:rPr>
+                <w:rFonts w:ascii="宋体" w:hAnsi="宋体" w:cs="宋体" w:hint="eastAsia"/>
+                <w:b/>
+                <w:bCs/>
+                <w:szCs w:val="21"/>
+              </w:rPr>
+              <w:t>yml</w:t>
+            </w:r>
+            <w:proofErr w:type="spellEnd"/>
+            <w:r>
+              <w:rPr>
+                <w:rFonts w:ascii="宋体" w:hAnsi="宋体" w:cs="宋体" w:hint="eastAsia"/>
+                <w:b/>
+                <w:bCs/>
+                <w:szCs w:val="21"/>
+              </w:rPr>
+              <w:t xml:space="preserve"> 脚本进行基础设施一键拉起与服务编排，彻底打通环境一致性，符合现代云原生企业级部署标准。</w:t>
             </w:r>
           </w:p>
         </w:tc>
       </w:tr>
     </w:tbl>
-    <w:p>
-      <w:pPr>
-        <w:rPr>
-          <w:rFonts w:hint="eastAsia"/>
-        </w:rPr>
-      </w:pPr>
-    </w:p>
+    <w:p/>
     <w:p>
       <w:pPr>
         <w:jc w:val="center"/>
         <w:rPr>
-          <w:rFonts w:hint="eastAsia"/>
           <w:b/>
           <w:bCs/>
           <w:sz w:val="28"/>
           <w:szCs w:val="36"/>
         </w:rPr>
       </w:pPr>
-      <w:bookmarkStart w:name="_GoBack" w:id="0"/>
       <w:r>
         <w:rPr>
           <w:rFonts w:hint="eastAsia"/>
@@ -659,11 +1666,10 @@
         <w:t>现场答辩拍照</w:t>
       </w:r>
     </w:p>
-    <w:bookmarkEnd w:id="0"/>
     <w:p>
       <w:pPr>
         <w:rPr>
-          <w:rFonts w:hint="eastAsia" w:ascii="宋体" w:hAnsi="宋体" w:cs="宋体"/>
+          <w:rFonts w:ascii="宋体" w:hAnsi="宋体" w:cs="宋体"/>
           <w:sz w:val="24"/>
         </w:rPr>
       </w:pPr>
@@ -671,7 +1677,7 @@
     <w:p>
       <w:pPr>
         <w:rPr>
-          <w:rFonts w:hint="eastAsia" w:ascii="宋体" w:hAnsi="宋体" w:cs="宋体"/>
+          <w:rFonts w:ascii="宋体" w:hAnsi="宋体" w:cs="宋体"/>
           <w:sz w:val="24"/>
         </w:rPr>
       </w:pPr>
@@ -679,174 +1685,96 @@
     <w:sectPr>
       <w:pgSz w:w="11906" w:h="16838"/>
       <w:pgMar w:top="1440" w:right="1800" w:bottom="993" w:left="1800" w:header="851" w:footer="992" w:gutter="0"/>
-      <w:cols w:space="720" w:num="1"/>
-      <w:docGrid w:type="lines" w:linePitch="312" w:charSpace="0"/>
+      <w:cols w:space="720"/>
+      <w:docGrid w:type="lines" w:linePitch="312"/>
     </w:sectPr>
   </w:body>
 </w:document>
 </file>
 
 <file path=word/styles.xml><?xml version="1.0" encoding="utf-8"?>
-<w:styles xmlns:mc="http://schemas.openxmlformats.org/markup-compatibility/2006" xmlns:o="urn:schemas-microsoft-com:office:office" xmlns:r="http://schemas.openxmlformats.org/officeDocument/2006/relationships" xmlns:m="http://schemas.openxmlformats.org/officeDocument/2006/math" xmlns:v="urn:schemas-microsoft-com:vml" xmlns:w="http://schemas.openxmlformats.org/wordprocessingml/2006/main" xmlns:w14="http://schemas.microsoft.com/office/word/2010/wordml" xmlns:w10="urn:schemas-microsoft-com:office:word" xmlns:sl="http://schemas.openxmlformats.org/schemaLibrary/2006/main" xmlns:wpsCustomData="http://www.wps.cn/officeDocument/2013/wpsCustomData" mc:Ignorable="w14">
+<w:styles xmlns:mc="http://schemas.openxmlformats.org/markup-compatibility/2006" xmlns:r="http://schemas.openxmlformats.org/officeDocument/2006/relationships" xmlns:w="http://schemas.openxmlformats.org/wordprocessingml/2006/main" xmlns:w14="http://schemas.microsoft.com/office/word/2010/wordml" xmlns:w15="http://schemas.microsoft.com/office/word/2012/wordml" xmlns:w16cex="http://schemas.microsoft.com/office/word/2018/wordml/cex" xmlns:w16cid="http://schemas.microsoft.com/office/word/2016/wordml/cid" xmlns:w16="http://schemas.microsoft.com/office/word/2018/wordml" xmlns:w16du="http://schemas.microsoft.com/office/word/2023/wordml/word16du" xmlns:w16sdtdh="http://schemas.microsoft.com/office/word/2020/wordml/sdtdatahash" xmlns:w16sdtfl="http://schemas.microsoft.com/office/word/2024/wordml/sdtformatlock" xmlns:w16se="http://schemas.microsoft.com/office/word/2015/wordml/symex" mc:Ignorable="w14 w15 w16se w16cid w16 w16cex w16sdtdh w16sdtfl w16du">
   <w:docDefaults>
     <w:rPrDefault>
       <w:rPr>
-        <w:rFonts w:ascii="Times New Roman" w:hAnsi="Times New Roman" w:eastAsia="宋体" w:cs="Times New Roman"/>
+        <w:rFonts w:ascii="Times New Roman" w:eastAsia="宋体" w:hAnsi="Times New Roman" w:cs="Times New Roman"/>
+        <w:lang w:val="en-US" w:eastAsia="zh-CN" w:bidi="ar-SA"/>
       </w:rPr>
     </w:rPrDefault>
     <w:pPrDefault/>
   </w:docDefaults>
-  <w:latentStyles w:defLockedState="0" w:defUIPriority="99" w:defSemiHidden="1" w:defUnhideWhenUsed="1" w:defQFormat="0" w:count="260">
-    <w:lsdException w:name="Normal" w:uiPriority="0" w:semiHidden="0" w:unhideWhenUsed="0" w:qFormat="1"/>
-    <w:lsdException w:name="heading 1" w:uiPriority="0" w:semiHidden="0" w:unhideWhenUsed="0" w:qFormat="1"/>
-    <w:lsdException w:name="heading 2" w:uiPriority="9" w:semiHidden="0" w:unhideWhenUsed="0" w:qFormat="1"/>
-    <w:lsdException w:name="heading 3" w:uiPriority="0" w:semiHidden="0" w:unhideWhenUsed="0" w:qFormat="1"/>
-    <w:lsdException w:name="heading 4" w:uiPriority="0" w:semiHidden="0" w:unhideWhenUsed="0" w:qFormat="1"/>
-    <w:lsdException w:name="heading 5" w:uiPriority="0" w:qFormat="1"/>
-    <w:lsdException w:name="heading 6" w:uiPriority="0" w:qFormat="1"/>
-    <w:lsdException w:name="heading 7" w:uiPriority="0" w:qFormat="1"/>
-    <w:lsdException w:name="heading 8" w:uiPriority="0" w:qFormat="1"/>
-    <w:lsdException w:name="heading 9" w:uiPriority="0" w:qFormat="1"/>
-    <w:lsdException w:name="index 1" w:uiPriority="0" w:semiHidden="0" w:unhideWhenUsed="0"/>
-    <w:lsdException w:name="index 2" w:uiPriority="0" w:semiHidden="0" w:unhideWhenUsed="0"/>
-    <w:lsdException w:name="index 3" w:uiPriority="0" w:semiHidden="0" w:unhideWhenUsed="0"/>
-    <w:lsdException w:name="index 4" w:uiPriority="0" w:semiHidden="0" w:unhideWhenUsed="0"/>
-    <w:lsdException w:name="index 5" w:uiPriority="0" w:semiHidden="0" w:unhideWhenUsed="0"/>
-    <w:lsdException w:name="index 6" w:uiPriority="0" w:semiHidden="0" w:unhideWhenUsed="0"/>
-    <w:lsdException w:name="index 7" w:uiPriority="0" w:semiHidden="0" w:unhideWhenUsed="0"/>
-    <w:lsdException w:name="index 8" w:uiPriority="0" w:semiHidden="0" w:unhideWhenUsed="0"/>
-    <w:lsdException w:name="index 9" w:uiPriority="0" w:semiHidden="0" w:unhideWhenUsed="0"/>
-    <w:lsdException w:name="toc 1" w:uiPriority="0" w:semiHidden="0" w:unhideWhenUsed="0"/>
-    <w:lsdException w:name="toc 2" w:uiPriority="0" w:semiHidden="0" w:unhideWhenUsed="0"/>
-    <w:lsdException w:name="toc 3" w:uiPriority="0" w:semiHidden="0" w:unhideWhenUsed="0"/>
-    <w:lsdException w:name="toc 4" w:uiPriority="0" w:semiHidden="0" w:unhideWhenUsed="0"/>
-    <w:lsdException w:name="toc 5" w:uiPriority="0" w:semiHidden="0" w:unhideWhenUsed="0"/>
-    <w:lsdException w:name="toc 6" w:uiPriority="0" w:semiHidden="0" w:unhideWhenUsed="0"/>
-    <w:lsdException w:name="toc 7" w:uiPriority="0" w:semiHidden="0" w:unhideWhenUsed="0"/>
-    <w:lsdException w:name="toc 8" w:uiPriority="0" w:semiHidden="0" w:unhideWhenUsed="0"/>
-    <w:lsdException w:name="toc 9" w:uiPriority="0" w:semiHidden="0" w:unhideWhenUsed="0"/>
-    <w:lsdException w:name="Normal Indent" w:uiPriority="0" w:semiHidden="0" w:unhideWhenUsed="0"/>
-    <w:lsdException w:name="footnote text" w:uiPriority="0" w:semiHidden="0" w:unhideWhenUsed="0"/>
-    <w:lsdException w:name="annotation text" w:uiPriority="0" w:semiHidden="0" w:unhideWhenUsed="0"/>
-    <w:lsdException w:name="header" w:uiPriority="0" w:semiHidden="0" w:unhideWhenUsed="0"/>
-    <w:lsdException w:name="footer" w:uiPriority="0" w:semiHidden="0" w:unhideWhenUsed="0"/>
-    <w:lsdException w:name="index heading" w:uiPriority="0" w:semiHidden="0" w:unhideWhenUsed="0"/>
-    <w:lsdException w:name="caption" w:uiPriority="0" w:qFormat="1"/>
-    <w:lsdException w:name="table of figures" w:uiPriority="0" w:semiHidden="0" w:unhideWhenUsed="0"/>
-    <w:lsdException w:name="envelope address" w:uiPriority="0" w:semiHidden="0" w:unhideWhenUsed="0"/>
-    <w:lsdException w:name="envelope return" w:uiPriority="0" w:semiHidden="0" w:unhideWhenUsed="0"/>
-    <w:lsdException w:name="footnote reference" w:uiPriority="0" w:semiHidden="0" w:unhideWhenUsed="0"/>
-    <w:lsdException w:name="annotation reference" w:uiPriority="0" w:semiHidden="0" w:unhideWhenUsed="0"/>
-    <w:lsdException w:name="line number" w:uiPriority="0" w:semiHidden="0" w:unhideWhenUsed="0"/>
-    <w:lsdException w:name="page number" w:uiPriority="0" w:semiHidden="0" w:unhideWhenUsed="0"/>
-    <w:lsdException w:name="endnote reference" w:uiPriority="0" w:semiHidden="0" w:unhideWhenUsed="0"/>
-    <w:lsdException w:name="endnote text" w:uiPriority="0" w:semiHidden="0" w:unhideWhenUsed="0"/>
-    <w:lsdException w:name="table of authorities" w:uiPriority="0" w:semiHidden="0" w:unhideWhenUsed="0"/>
-    <w:lsdException w:name="macro" w:uiPriority="0" w:semiHidden="0" w:unhideWhenUsed="0"/>
-    <w:lsdException w:name="toa heading" w:uiPriority="0" w:semiHidden="0" w:unhideWhenUsed="0"/>
-    <w:lsdException w:name="List" w:uiPriority="0" w:semiHidden="0" w:unhideWhenUsed="0"/>
-    <w:lsdException w:name="List Bullet" w:uiPriority="0" w:semiHidden="0" w:unhideWhenUsed="0"/>
-    <w:lsdException w:name="List Number" w:uiPriority="0" w:semiHidden="0" w:unhideWhenUsed="0"/>
-    <w:lsdException w:name="List 2" w:uiPriority="0" w:semiHidden="0" w:unhideWhenUsed="0"/>
-    <w:lsdException w:name="List 3" w:uiPriority="0" w:semiHidden="0" w:unhideWhenUsed="0"/>
-    <w:lsdException w:name="List 4" w:uiPriority="0" w:semiHidden="0" w:unhideWhenUsed="0"/>
-    <w:lsdException w:name="List 5" w:uiPriority="0" w:semiHidden="0" w:unhideWhenUsed="0"/>
-    <w:lsdException w:name="List Bullet 2" w:uiPriority="0" w:semiHidden="0" w:unhideWhenUsed="0"/>
-    <w:lsdException w:name="List Bullet 3" w:uiPriority="0" w:semiHidden="0" w:unhideWhenUsed="0"/>
-    <w:lsdException w:name="List Bullet 4" w:uiPriority="0" w:semiHidden="0" w:unhideWhenUsed="0"/>
-    <w:lsdException w:name="List Bullet 5" w:uiPriority="0" w:semiHidden="0" w:unhideWhenUsed="0"/>
-    <w:lsdException w:name="List Number 2" w:uiPriority="0" w:semiHidden="0" w:unhideWhenUsed="0"/>
-    <w:lsdException w:name="List Number 3" w:uiPriority="0" w:semiHidden="0" w:unhideWhenUsed="0"/>
-    <w:lsdException w:name="List Number 4" w:uiPriority="0" w:semiHidden="0" w:unhideWhenUsed="0"/>
-    <w:lsdException w:name="List Number 5" w:uiPriority="0" w:semiHidden="0" w:unhideWhenUsed="0"/>
-    <w:lsdException w:name="Title" w:uiPriority="0" w:semiHidden="0" w:unhideWhenUsed="0" w:qFormat="1"/>
-    <w:lsdException w:name="Closing" w:uiPriority="0" w:semiHidden="0" w:unhideWhenUsed="0"/>
-    <w:lsdException w:name="Signature" w:uiPriority="0" w:semiHidden="0" w:unhideWhenUsed="0"/>
-    <w:lsdException w:name="Default Paragraph Font" w:uiPriority="0" w:unhideWhenUsed="0"/>
-    <w:lsdException w:name="Body Text" w:uiPriority="0" w:semiHidden="0" w:unhideWhenUsed="0"/>
-    <w:lsdException w:name="Body Text Indent" w:uiPriority="0" w:semiHidden="0" w:unhideWhenUsed="0"/>
-    <w:lsdException w:name="List Continue" w:uiPriority="0" w:semiHidden="0" w:unhideWhenUsed="0"/>
-    <w:lsdException w:name="List Continue 2" w:uiPriority="0" w:semiHidden="0" w:unhideWhenUsed="0"/>
-    <w:lsdException w:name="List Continue 3" w:uiPriority="0" w:semiHidden="0" w:unhideWhenUsed="0"/>
-    <w:lsdException w:name="List Continue 4" w:uiPriority="0" w:semiHidden="0" w:unhideWhenUsed="0"/>
-    <w:lsdException w:name="List Continue 5" w:uiPriority="0" w:semiHidden="0" w:unhideWhenUsed="0"/>
-    <w:lsdException w:name="Message Header" w:uiPriority="0" w:semiHidden="0" w:unhideWhenUsed="0"/>
-    <w:lsdException w:name="Subtitle" w:uiPriority="0" w:semiHidden="0" w:unhideWhenUsed="0" w:qFormat="1"/>
-    <w:lsdException w:name="Salutation" w:uiPriority="0" w:semiHidden="0" w:unhideWhenUsed="0"/>
-    <w:lsdException w:name="Date" w:uiPriority="0" w:semiHidden="0" w:unhideWhenUsed="0"/>
-    <w:lsdException w:name="Body Text First Indent" w:uiPriority="0" w:semiHidden="0" w:unhideWhenUsed="0"/>
-    <w:lsdException w:name="Body Text First Indent 2" w:uiPriority="0" w:semiHidden="0" w:unhideWhenUsed="0"/>
-    <w:lsdException w:name="Note Heading" w:uiPriority="0" w:semiHidden="0" w:unhideWhenUsed="0"/>
-    <w:lsdException w:name="Body Text 2" w:uiPriority="0" w:semiHidden="0" w:unhideWhenUsed="0"/>
-    <w:lsdException w:name="Body Text 3" w:uiPriority="0" w:semiHidden="0" w:unhideWhenUsed="0"/>
-    <w:lsdException w:name="Body Text Indent 2" w:uiPriority="0" w:semiHidden="0" w:unhideWhenUsed="0"/>
-    <w:lsdException w:name="Body Text Indent 3" w:uiPriority="0" w:semiHidden="0" w:unhideWhenUsed="0"/>
-    <w:lsdException w:name="Block Text" w:uiPriority="0" w:semiHidden="0" w:unhideWhenUsed="0"/>
-    <w:lsdException w:name="Hyperlink" w:uiPriority="99" w:semiHidden="0"/>
-    <w:lsdException w:name="FollowedHyperlink" w:uiPriority="0" w:semiHidden="0" w:unhideWhenUsed="0"/>
-    <w:lsdException w:name="Strong" w:uiPriority="22" w:semiHidden="0" w:unhideWhenUsed="0" w:qFormat="1"/>
-    <w:lsdException w:name="Emphasis" w:uiPriority="20" w:semiHidden="0" w:unhideWhenUsed="0" w:qFormat="1"/>
-    <w:lsdException w:name="Document Map" w:uiPriority="0" w:semiHidden="0" w:unhideWhenUsed="0"/>
-    <w:lsdException w:name="Plain Text" w:uiPriority="0" w:semiHidden="0" w:unhideWhenUsed="0"/>
-    <w:lsdException w:name="E-mail Signature" w:uiPriority="0" w:semiHidden="0" w:unhideWhenUsed="0"/>
-    <w:lsdException w:name="Normal (Web)" w:uiPriority="99" w:semiHidden="0"/>
-    <w:lsdException w:name="HTML Acronym" w:uiPriority="0" w:semiHidden="0" w:unhideWhenUsed="0"/>
-    <w:lsdException w:name="HTML Address" w:uiPriority="0" w:semiHidden="0" w:unhideWhenUsed="0"/>
-    <w:lsdException w:name="HTML Cite" w:uiPriority="0" w:semiHidden="0" w:unhideWhenUsed="0"/>
-    <w:lsdException w:name="HTML Code" w:uiPriority="0" w:semiHidden="0" w:unhideWhenUsed="0"/>
-    <w:lsdException w:name="HTML Definition" w:uiPriority="0" w:semiHidden="0" w:unhideWhenUsed="0"/>
-    <w:lsdException w:name="HTML Keyboard" w:uiPriority="0" w:semiHidden="0" w:unhideWhenUsed="0"/>
-    <w:lsdException w:name="HTML Preformatted" w:uiPriority="99" w:semiHidden="0"/>
-    <w:lsdException w:name="HTML Sample" w:uiPriority="0" w:semiHidden="0" w:unhideWhenUsed="0"/>
-    <w:lsdException w:name="HTML Typewriter" w:uiPriority="0" w:semiHidden="0" w:unhideWhenUsed="0"/>
-    <w:lsdException w:name="HTML Variable" w:uiPriority="0" w:semiHidden="0" w:unhideWhenUsed="0"/>
-    <w:lsdException w:name="Normal Table" w:uiPriority="0" w:unhideWhenUsed="0"/>
-    <w:lsdException w:name="annotation subject" w:uiPriority="0" w:semiHidden="0" w:unhideWhenUsed="0"/>
-    <w:lsdException w:name="Table Simple 1" w:uiPriority="0" w:semiHidden="0" w:unhideWhenUsed="0"/>
-    <w:lsdException w:name="Table Simple 2" w:uiPriority="0" w:semiHidden="0" w:unhideWhenUsed="0"/>
-    <w:lsdException w:name="Table Simple 3" w:uiPriority="0" w:semiHidden="0" w:unhideWhenUsed="0"/>
-    <w:lsdException w:name="Table Classic 1" w:uiPriority="0" w:semiHidden="0" w:unhideWhenUsed="0"/>
-    <w:lsdException w:name="Table Classic 2" w:uiPriority="0" w:semiHidden="0" w:unhideWhenUsed="0"/>
-    <w:lsdException w:name="Table Classic 3" w:uiPriority="0" w:semiHidden="0" w:unhideWhenUsed="0"/>
-    <w:lsdException w:name="Table Classic 4" w:uiPriority="0" w:semiHidden="0" w:unhideWhenUsed="0"/>
-    <w:lsdException w:name="Table Colorful 1" w:uiPriority="0" w:semiHidden="0" w:unhideWhenUsed="0"/>
-    <w:lsdException w:name="Table Colorful 2" w:uiPriority="0" w:semiHidden="0" w:unhideWhenUsed="0"/>
-    <w:lsdException w:name="Table Colorful 3" w:uiPriority="0" w:semiHidden="0" w:unhideWhenUsed="0"/>
-    <w:lsdException w:name="Table Columns 1" w:uiPriority="0" w:semiHidden="0" w:unhideWhenUsed="0"/>
-    <w:lsdException w:name="Table Columns 2" w:uiPriority="0" w:semiHidden="0" w:unhideWhenUsed="0"/>
-    <w:lsdException w:name="Table Columns 3" w:uiPriority="0" w:semiHidden="0" w:unhideWhenUsed="0"/>
-    <w:lsdException w:name="Table Columns 4" w:uiPriority="0" w:semiHidden="0" w:unhideWhenUsed="0"/>
-    <w:lsdException w:name="Table Columns 5" w:uiPriority="0" w:semiHidden="0" w:unhideWhenUsed="0"/>
-    <w:lsdException w:name="Table Grid 1" w:uiPriority="0" w:semiHidden="0" w:unhideWhenUsed="0"/>
-    <w:lsdException w:name="Table Grid 2" w:uiPriority="0" w:semiHidden="0" w:unhideWhenUsed="0"/>
-    <w:lsdException w:name="Table Grid 3" w:uiPriority="0" w:semiHidden="0" w:unhideWhenUsed="0"/>
-    <w:lsdException w:name="Table Grid 4" w:uiPriority="0" w:semiHidden="0" w:unhideWhenUsed="0"/>
-    <w:lsdException w:name="Table Grid 5" w:uiPriority="0" w:semiHidden="0" w:unhideWhenUsed="0"/>
-    <w:lsdException w:name="Table Grid 6" w:uiPriority="0" w:semiHidden="0" w:unhideWhenUsed="0"/>
-    <w:lsdException w:name="Table Grid 7" w:uiPriority="0" w:semiHidden="0" w:unhideWhenUsed="0"/>
-    <w:lsdException w:name="Table Grid 8" w:uiPriority="0" w:semiHidden="0" w:unhideWhenUsed="0"/>
-    <w:lsdException w:name="Table List 1" w:uiPriority="0" w:semiHidden="0" w:unhideWhenUsed="0"/>
-    <w:lsdException w:name="Table List 2" w:uiPriority="0" w:semiHidden="0" w:unhideWhenUsed="0"/>
-    <w:lsdException w:name="Table List 3" w:uiPriority="0" w:semiHidden="0" w:unhideWhenUsed="0"/>
-    <w:lsdException w:name="Table List 4" w:uiPriority="0" w:semiHidden="0" w:unhideWhenUsed="0"/>
-    <w:lsdException w:name="Table List 5" w:uiPriority="0" w:semiHidden="0" w:unhideWhenUsed="0"/>
-    <w:lsdException w:name="Table List 6" w:uiPriority="0" w:semiHidden="0" w:unhideWhenUsed="0"/>
-    <w:lsdException w:name="Table List 7" w:uiPriority="0" w:semiHidden="0" w:unhideWhenUsed="0"/>
-    <w:lsdException w:name="Table List 8" w:uiPriority="0" w:semiHidden="0" w:unhideWhenUsed="0"/>
-    <w:lsdException w:name="Table 3D effects 1" w:uiPriority="0" w:semiHidden="0" w:unhideWhenUsed="0"/>
-    <w:lsdException w:name="Table 3D effects 2" w:uiPriority="0" w:semiHidden="0" w:unhideWhenUsed="0"/>
-    <w:lsdException w:name="Table 3D effects 3" w:uiPriority="0" w:semiHidden="0" w:unhideWhenUsed="0"/>
-    <w:lsdException w:name="Table Contemporary" w:uiPriority="0" w:semiHidden="0" w:unhideWhenUsed="0"/>
-    <w:lsdException w:name="Table Elegant" w:uiPriority="0" w:semiHidden="0" w:unhideWhenUsed="0"/>
-    <w:lsdException w:name="Table Professional" w:uiPriority="0" w:semiHidden="0" w:unhideWhenUsed="0"/>
-    <w:lsdException w:name="Table Subtle 1" w:uiPriority="0" w:semiHidden="0" w:unhideWhenUsed="0"/>
-    <w:lsdException w:name="Table Subtle 2" w:uiPriority="0" w:semiHidden="0" w:unhideWhenUsed="0"/>
-    <w:lsdException w:name="Table Web 1" w:uiPriority="0" w:semiHidden="0" w:unhideWhenUsed="0"/>
-    <w:lsdException w:name="Table Web 2" w:uiPriority="0" w:semiHidden="0" w:unhideWhenUsed="0"/>
-    <w:lsdException w:name="Table Web 3" w:uiPriority="0" w:semiHidden="0" w:unhideWhenUsed="0"/>
-    <w:lsdException w:name="Balloon Text" w:uiPriority="0" w:semiHidden="0" w:unhideWhenUsed="0"/>
-    <w:lsdException w:name="Table Grid" w:uiPriority="0" w:semiHidden="0" w:unhideWhenUsed="0"/>
-    <w:lsdException w:name="Table Theme" w:uiPriority="0" w:semiHidden="0" w:unhideWhenUsed="0"/>
+  <w:latentStyles w:defLockedState="0" w:defUIPriority="0" w:defSemiHidden="0" w:defUnhideWhenUsed="0" w:defQFormat="0" w:count="376">
+    <w:lsdException w:name="Normal" w:qFormat="1"/>
+    <w:lsdException w:name="heading 1" w:qFormat="1"/>
+    <w:lsdException w:name="heading 2" w:uiPriority="9" w:qFormat="1"/>
+    <w:lsdException w:name="heading 3" w:qFormat="1"/>
+    <w:lsdException w:name="heading 4" w:qFormat="1"/>
+    <w:lsdException w:name="heading 5" w:semiHidden="1" w:unhideWhenUsed="1" w:qFormat="1"/>
+    <w:lsdException w:name="heading 6" w:semiHidden="1" w:unhideWhenUsed="1" w:qFormat="1"/>
+    <w:lsdException w:name="heading 7" w:semiHidden="1" w:unhideWhenUsed="1" w:qFormat="1"/>
+    <w:lsdException w:name="heading 8" w:semiHidden="1" w:unhideWhenUsed="1" w:qFormat="1"/>
+    <w:lsdException w:name="heading 9" w:semiHidden="1" w:unhideWhenUsed="1" w:qFormat="1"/>
+    <w:lsdException w:name="caption" w:semiHidden="1" w:unhideWhenUsed="1" w:qFormat="1"/>
+    <w:lsdException w:name="Title" w:qFormat="1"/>
+    <w:lsdException w:name="Default Paragraph Font" w:semiHidden="1"/>
+    <w:lsdException w:name="Subtitle" w:qFormat="1"/>
+    <w:lsdException w:name="Hyperlink" w:uiPriority="99" w:unhideWhenUsed="1"/>
+    <w:lsdException w:name="Strong" w:uiPriority="22" w:qFormat="1"/>
+    <w:lsdException w:name="Emphasis" w:uiPriority="20" w:qFormat="1"/>
+    <w:lsdException w:name="HTML Top of Form" w:semiHidden="1" w:uiPriority="99" w:unhideWhenUsed="1"/>
+    <w:lsdException w:name="HTML Bottom of Form" w:semiHidden="1" w:uiPriority="99" w:unhideWhenUsed="1"/>
+    <w:lsdException w:name="Normal (Web)" w:uiPriority="99" w:unhideWhenUsed="1"/>
+    <w:lsdException w:name="HTML Preformatted" w:uiPriority="99" w:unhideWhenUsed="1"/>
+    <w:lsdException w:name="Normal Table" w:semiHidden="1" w:unhideWhenUsed="1"/>
+    <w:lsdException w:name="No List" w:semiHidden="1" w:uiPriority="99" w:unhideWhenUsed="1"/>
+    <w:lsdException w:name="Outline List 1" w:semiHidden="1" w:uiPriority="99" w:unhideWhenUsed="1"/>
+    <w:lsdException w:name="Outline List 2" w:semiHidden="1" w:uiPriority="99" w:unhideWhenUsed="1"/>
+    <w:lsdException w:name="Outline List 3" w:semiHidden="1" w:uiPriority="99" w:unhideWhenUsed="1"/>
+    <w:lsdException w:name="Table Simple 1" w:semiHidden="1" w:unhideWhenUsed="1"/>
+    <w:lsdException w:name="Table Simple 2" w:semiHidden="1" w:unhideWhenUsed="1"/>
+    <w:lsdException w:name="Table Simple 3" w:semiHidden="1" w:unhideWhenUsed="1"/>
+    <w:lsdException w:name="Table Classic 1" w:semiHidden="1" w:unhideWhenUsed="1"/>
+    <w:lsdException w:name="Table Classic 2" w:semiHidden="1" w:unhideWhenUsed="1"/>
+    <w:lsdException w:name="Table Classic 3" w:semiHidden="1" w:unhideWhenUsed="1"/>
+    <w:lsdException w:name="Table Classic 4" w:semiHidden="1" w:unhideWhenUsed="1"/>
+    <w:lsdException w:name="Table Colorful 1" w:semiHidden="1" w:unhideWhenUsed="1"/>
+    <w:lsdException w:name="Table Colorful 2" w:semiHidden="1" w:unhideWhenUsed="1"/>
+    <w:lsdException w:name="Table Colorful 3" w:semiHidden="1" w:unhideWhenUsed="1"/>
+    <w:lsdException w:name="Table Columns 1" w:semiHidden="1" w:unhideWhenUsed="1"/>
+    <w:lsdException w:name="Table Columns 2" w:semiHidden="1" w:unhideWhenUsed="1"/>
+    <w:lsdException w:name="Table Columns 3" w:semiHidden="1" w:unhideWhenUsed="1"/>
+    <w:lsdException w:name="Table Columns 4" w:semiHidden="1" w:unhideWhenUsed="1"/>
+    <w:lsdException w:name="Table Columns 5" w:semiHidden="1" w:unhideWhenUsed="1"/>
+    <w:lsdException w:name="Table Grid 1" w:semiHidden="1" w:unhideWhenUsed="1"/>
+    <w:lsdException w:name="Table Grid 2" w:semiHidden="1" w:unhideWhenUsed="1"/>
+    <w:lsdException w:name="Table Grid 3" w:semiHidden="1" w:unhideWhenUsed="1"/>
+    <w:lsdException w:name="Table Grid 4" w:semiHidden="1" w:unhideWhenUsed="1"/>
+    <w:lsdException w:name="Table Grid 5" w:semiHidden="1" w:unhideWhenUsed="1"/>
+    <w:lsdException w:name="Table Grid 6" w:semiHidden="1" w:unhideWhenUsed="1"/>
+    <w:lsdException w:name="Table Grid 7" w:semiHidden="1" w:unhideWhenUsed="1"/>
+    <w:lsdException w:name="Table Grid 8" w:semiHidden="1" w:unhideWhenUsed="1"/>
+    <w:lsdException w:name="Table List 1" w:semiHidden="1" w:unhideWhenUsed="1"/>
+    <w:lsdException w:name="Table List 2" w:semiHidden="1" w:unhideWhenUsed="1"/>
+    <w:lsdException w:name="Table List 3" w:semiHidden="1" w:unhideWhenUsed="1"/>
+    <w:lsdException w:name="Table List 4" w:semiHidden="1" w:unhideWhenUsed="1"/>
+    <w:lsdException w:name="Table List 5" w:semiHidden="1" w:unhideWhenUsed="1"/>
+    <w:lsdException w:name="Table List 6" w:semiHidden="1" w:unhideWhenUsed="1"/>
+    <w:lsdException w:name="Table List 7" w:semiHidden="1" w:unhideWhenUsed="1"/>
+    <w:lsdException w:name="Table List 8" w:semiHidden="1" w:unhideWhenUsed="1"/>
+    <w:lsdException w:name="Table 3D effects 1" w:semiHidden="1" w:unhideWhenUsed="1"/>
+    <w:lsdException w:name="Table 3D effects 2" w:semiHidden="1" w:unhideWhenUsed="1"/>
+    <w:lsdException w:name="Table 3D effects 3" w:semiHidden="1" w:unhideWhenUsed="1"/>
+    <w:lsdException w:name="Table Contemporary" w:semiHidden="1" w:unhideWhenUsed="1"/>
+    <w:lsdException w:name="Table Elegant" w:semiHidden="1" w:unhideWhenUsed="1"/>
+    <w:lsdException w:name="Table Professional" w:semiHidden="1" w:unhideWhenUsed="1"/>
+    <w:lsdException w:name="Table Subtle 1" w:semiHidden="1" w:unhideWhenUsed="1"/>
+    <w:lsdException w:name="Table Subtle 2" w:semiHidden="1" w:unhideWhenUsed="1"/>
+    <w:lsdException w:name="Table Web 1" w:semiHidden="1" w:unhideWhenUsed="1"/>
+    <w:lsdException w:name="Table Web 2" w:semiHidden="1" w:unhideWhenUsed="1"/>
+    <w:lsdException w:name="Table Web 3" w:semiHidden="1" w:unhideWhenUsed="1"/>
+    <w:lsdException w:name="Table Theme" w:semiHidden="1" w:unhideWhenUsed="1"/>
+    <w:lsdException w:name="Placeholder Text" w:semiHidden="1" w:uiPriority="99" w:unhideWhenUsed="1"/>
+    <w:lsdException w:name="No Spacing" w:semiHidden="1" w:uiPriority="99" w:unhideWhenUsed="1"/>
     <w:lsdException w:name="Light Shading" w:uiPriority="1"/>
     <w:lsdException w:name="Light List" w:uiPriority="1"/>
     <w:lsdException w:name="Light Grid" w:uiPriority="1"/>
@@ -867,7 +1795,10 @@
     <w:lsdException w:name="Medium Shading 1 Accent 1" w:uiPriority="1"/>
     <w:lsdException w:name="Medium Shading 2 Accent 1" w:uiPriority="1"/>
     <w:lsdException w:name="Medium List 1 Accent 1" w:uiPriority="1"/>
-    <w:lsdException w:name="List Paragraph" w:uiPriority="99" w:semiHidden="0" w:unhideWhenUsed="0" w:qFormat="1"/>
+    <w:lsdException w:name="Revision" w:semiHidden="1" w:uiPriority="99" w:unhideWhenUsed="1"/>
+    <w:lsdException w:name="List Paragraph" w:uiPriority="99" w:qFormat="1"/>
+    <w:lsdException w:name="Quote" w:semiHidden="1" w:uiPriority="99" w:unhideWhenUsed="1"/>
+    <w:lsdException w:name="Intense Quote" w:semiHidden="1" w:uiPriority="99" w:unhideWhenUsed="1"/>
     <w:lsdException w:name="Medium List 2 Accent 1" w:uiPriority="1"/>
     <w:lsdException w:name="Medium Grid 1 Accent 1" w:uiPriority="1"/>
     <w:lsdException w:name="Medium Grid 2 Accent 1" w:uiPriority="1"/>
@@ -946,11 +1877,126 @@
     <w:lsdException w:name="Colorful Shading Accent 6" w:uiPriority="1"/>
     <w:lsdException w:name="Colorful List Accent 6" w:uiPriority="1"/>
     <w:lsdException w:name="Colorful Grid Accent 6" w:uiPriority="1"/>
+    <w:lsdException w:name="Subtle Emphasis" w:uiPriority="19" w:qFormat="1"/>
+    <w:lsdException w:name="Intense Emphasis" w:uiPriority="21" w:qFormat="1"/>
+    <w:lsdException w:name="Subtle Reference" w:uiPriority="31" w:qFormat="1"/>
+    <w:lsdException w:name="Intense Reference" w:uiPriority="32" w:qFormat="1"/>
+    <w:lsdException w:name="Book Title" w:uiPriority="33" w:qFormat="1"/>
+    <w:lsdException w:name="Bibliography" w:semiHidden="1" w:uiPriority="37" w:unhideWhenUsed="1"/>
+    <w:lsdException w:name="TOC Heading" w:semiHidden="1" w:uiPriority="39" w:unhideWhenUsed="1" w:qFormat="1"/>
+    <w:lsdException w:name="Plain Table 1" w:uiPriority="41"/>
+    <w:lsdException w:name="Plain Table 2" w:uiPriority="42"/>
+    <w:lsdException w:name="Plain Table 3" w:uiPriority="43"/>
+    <w:lsdException w:name="Plain Table 4" w:uiPriority="44"/>
+    <w:lsdException w:name="Plain Table 5" w:uiPriority="45"/>
+    <w:lsdException w:name="Grid Table Light" w:uiPriority="40"/>
+    <w:lsdException w:name="Grid Table 1 Light" w:uiPriority="46"/>
+    <w:lsdException w:name="Grid Table 2" w:uiPriority="47"/>
+    <w:lsdException w:name="Grid Table 3" w:uiPriority="48"/>
+    <w:lsdException w:name="Grid Table 4" w:uiPriority="49"/>
+    <w:lsdException w:name="Grid Table 5 Dark" w:uiPriority="50"/>
+    <w:lsdException w:name="Grid Table 6 Colorful" w:uiPriority="51"/>
+    <w:lsdException w:name="Grid Table 7 Colorful" w:uiPriority="52"/>
+    <w:lsdException w:name="Grid Table 1 Light Accent 1" w:uiPriority="46"/>
+    <w:lsdException w:name="Grid Table 2 Accent 1" w:uiPriority="47"/>
+    <w:lsdException w:name="Grid Table 3 Accent 1" w:uiPriority="48"/>
+    <w:lsdException w:name="Grid Table 4 Accent 1" w:uiPriority="49"/>
+    <w:lsdException w:name="Grid Table 5 Dark Accent 1" w:uiPriority="50"/>
+    <w:lsdException w:name="Grid Table 6 Colorful Accent 1" w:uiPriority="51"/>
+    <w:lsdException w:name="Grid Table 7 Colorful Accent 1" w:uiPriority="52"/>
+    <w:lsdException w:name="Grid Table 1 Light Accent 2" w:uiPriority="46"/>
+    <w:lsdException w:name="Grid Table 2 Accent 2" w:uiPriority="47"/>
+    <w:lsdException w:name="Grid Table 3 Accent 2" w:uiPriority="48"/>
+    <w:lsdException w:name="Grid Table 4 Accent 2" w:uiPriority="49"/>
+    <w:lsdException w:name="Grid Table 5 Dark Accent 2" w:uiPriority="50"/>
+    <w:lsdException w:name="Grid Table 6 Colorful Accent 2" w:uiPriority="51"/>
+    <w:lsdException w:name="Grid Table 7 Colorful Accent 2" w:uiPriority="52"/>
+    <w:lsdException w:name="Grid Table 1 Light Accent 3" w:uiPriority="46"/>
+    <w:lsdException w:name="Grid Table 2 Accent 3" w:uiPriority="47"/>
+    <w:lsdException w:name="Grid Table 3 Accent 3" w:uiPriority="48"/>
+    <w:lsdException w:name="Grid Table 4 Accent 3" w:uiPriority="49"/>
+    <w:lsdException w:name="Grid Table 5 Dark Accent 3" w:uiPriority="50"/>
+    <w:lsdException w:name="Grid Table 6 Colorful Accent 3" w:uiPriority="51"/>
+    <w:lsdException w:name="Grid Table 7 Colorful Accent 3" w:uiPriority="52"/>
+    <w:lsdException w:name="Grid Table 1 Light Accent 4" w:uiPriority="46"/>
+    <w:lsdException w:name="Grid Table 2 Accent 4" w:uiPriority="47"/>
+    <w:lsdException w:name="Grid Table 3 Accent 4" w:uiPriority="48"/>
+    <w:lsdException w:name="Grid Table 4 Accent 4" w:uiPriority="49"/>
+    <w:lsdException w:name="Grid Table 5 Dark Accent 4" w:uiPriority="50"/>
+    <w:lsdException w:name="Grid Table 6 Colorful Accent 4" w:uiPriority="51"/>
+    <w:lsdException w:name="Grid Table 7 Colorful Accent 4" w:uiPriority="52"/>
+    <w:lsdException w:name="Grid Table 1 Light Accent 5" w:uiPriority="46"/>
+    <w:lsdException w:name="Grid Table 2 Accent 5" w:uiPriority="47"/>
+    <w:lsdException w:name="Grid Table 3 Accent 5" w:uiPriority="48"/>
+    <w:lsdException w:name="Grid Table 4 Accent 5" w:uiPriority="49"/>
+    <w:lsdException w:name="Grid Table 5 Dark Accent 5" w:uiPriority="50"/>
+    <w:lsdException w:name="Grid Table 6 Colorful Accent 5" w:uiPriority="51"/>
+    <w:lsdException w:name="Grid Table 7 Colorful Accent 5" w:uiPriority="52"/>
+    <w:lsdException w:name="Grid Table 1 Light Accent 6" w:uiPriority="46"/>
+    <w:lsdException w:name="Grid Table 2 Accent 6" w:uiPriority="47"/>
+    <w:lsdException w:name="Grid Table 3 Accent 6" w:uiPriority="48"/>
+    <w:lsdException w:name="Grid Table 4 Accent 6" w:uiPriority="49"/>
+    <w:lsdException w:name="Grid Table 5 Dark Accent 6" w:uiPriority="50"/>
+    <w:lsdException w:name="Grid Table 6 Colorful Accent 6" w:uiPriority="51"/>
+    <w:lsdException w:name="Grid Table 7 Colorful Accent 6" w:uiPriority="52"/>
+    <w:lsdException w:name="List Table 1 Light" w:uiPriority="46"/>
+    <w:lsdException w:name="List Table 2" w:uiPriority="47"/>
+    <w:lsdException w:name="List Table 3" w:uiPriority="48"/>
+    <w:lsdException w:name="List Table 4" w:uiPriority="49"/>
+    <w:lsdException w:name="List Table 5 Dark" w:uiPriority="50"/>
+    <w:lsdException w:name="List Table 6 Colorful" w:uiPriority="51"/>
+    <w:lsdException w:name="List Table 7 Colorful" w:uiPriority="52"/>
+    <w:lsdException w:name="List Table 1 Light Accent 1" w:uiPriority="46"/>
+    <w:lsdException w:name="List Table 2 Accent 1" w:uiPriority="47"/>
+    <w:lsdException w:name="List Table 3 Accent 1" w:uiPriority="48"/>
+    <w:lsdException w:name="List Table 4 Accent 1" w:uiPriority="49"/>
+    <w:lsdException w:name="List Table 5 Dark Accent 1" w:uiPriority="50"/>
+    <w:lsdException w:name="List Table 6 Colorful Accent 1" w:uiPriority="51"/>
+    <w:lsdException w:name="List Table 7 Colorful Accent 1" w:uiPriority="52"/>
+    <w:lsdException w:name="List Table 1 Light Accent 2" w:uiPriority="46"/>
+    <w:lsdException w:name="List Table 2 Accent 2" w:uiPriority="47"/>
+    <w:lsdException w:name="List Table 3 Accent 2" w:uiPriority="48"/>
+    <w:lsdException w:name="List Table 4 Accent 2" w:uiPriority="49"/>
+    <w:lsdException w:name="List Table 5 Dark Accent 2" w:uiPriority="50"/>
+    <w:lsdException w:name="List Table 6 Colorful Accent 2" w:uiPriority="51"/>
+    <w:lsdException w:name="List Table 7 Colorful Accent 2" w:uiPriority="52"/>
+    <w:lsdException w:name="List Table 1 Light Accent 3" w:uiPriority="46"/>
+    <w:lsdException w:name="List Table 2 Accent 3" w:uiPriority="47"/>
+    <w:lsdException w:name="List Table 3 Accent 3" w:uiPriority="48"/>
+    <w:lsdException w:name="List Table 4 Accent 3" w:uiPriority="49"/>
+    <w:lsdException w:name="List Table 5 Dark Accent 3" w:uiPriority="50"/>
+    <w:lsdException w:name="List Table 6 Colorful Accent 3" w:uiPriority="51"/>
+    <w:lsdException w:name="List Table 7 Colorful Accent 3" w:uiPriority="52"/>
+    <w:lsdException w:name="List Table 1 Light Accent 4" w:uiPriority="46"/>
+    <w:lsdException w:name="List Table 2 Accent 4" w:uiPriority="47"/>
+    <w:lsdException w:name="List Table 3 Accent 4" w:uiPriority="48"/>
+    <w:lsdException w:name="List Table 4 Accent 4" w:uiPriority="49"/>
+    <w:lsdException w:name="List Table 5 Dark Accent 4" w:uiPriority="50"/>
+    <w:lsdException w:name="List Table 6 Colorful Accent 4" w:uiPriority="51"/>
+    <w:lsdException w:name="List Table 7 Colorful Accent 4" w:uiPriority="52"/>
+    <w:lsdException w:name="List Table 1 Light Accent 5" w:uiPriority="46"/>
+    <w:lsdException w:name="List Table 2 Accent 5" w:uiPriority="47"/>
+    <w:lsdException w:name="List Table 3 Accent 5" w:uiPriority="48"/>
+    <w:lsdException w:name="List Table 4 Accent 5" w:uiPriority="49"/>
+    <w:lsdException w:name="List Table 5 Dark Accent 5" w:uiPriority="50"/>
+    <w:lsdException w:name="List Table 6 Colorful Accent 5" w:uiPriority="51"/>
+    <w:lsdException w:name="List Table 7 Colorful Accent 5" w:uiPriority="52"/>
+    <w:lsdException w:name="List Table 1 Light Accent 6" w:uiPriority="46"/>
+    <w:lsdException w:name="List Table 2 Accent 6" w:uiPriority="47"/>
+    <w:lsdException w:name="List Table 3 Accent 6" w:uiPriority="48"/>
+    <w:lsdException w:name="List Table 4 Accent 6" w:uiPriority="49"/>
+    <w:lsdException w:name="List Table 5 Dark Accent 6" w:uiPriority="50"/>
+    <w:lsdException w:name="List Table 6 Colorful Accent 6" w:uiPriority="51"/>
+    <w:lsdException w:name="List Table 7 Colorful Accent 6" w:uiPriority="52"/>
+    <w:lsdException w:name="Mention" w:semiHidden="1" w:uiPriority="99" w:unhideWhenUsed="1"/>
+    <w:lsdException w:name="Smart Hyperlink" w:semiHidden="1" w:uiPriority="99" w:unhideWhenUsed="1"/>
+    <w:lsdException w:name="Hashtag" w:semiHidden="1" w:uiPriority="99" w:unhideWhenUsed="1"/>
+    <w:lsdException w:name="Unresolved Mention" w:semiHidden="1" w:uiPriority="99" w:unhideWhenUsed="1"/>
+    <w:lsdException w:name="Smart Link" w:semiHidden="1" w:uiPriority="99" w:unhideWhenUsed="1"/>
   </w:latentStyles>
-  <w:style w:type="paragraph" w:styleId="1" w:default="1">
+  <w:style w:type="paragraph" w:default="1" w:styleId="a">
     <w:name w:val="Normal"/>
     <w:qFormat/>
-    <w:uiPriority w:val="0"/>
     <w:pPr>
       <w:widowControl w:val="0"/>
       <w:jc w:val="both"/>
@@ -959,15 +2005,14 @@
       <w:kern w:val="2"/>
       <w:sz w:val="21"/>
       <w:szCs w:val="24"/>
-      <w:lang w:val="en-US" w:eastAsia="zh-CN" w:bidi="ar-SA"/>
     </w:rPr>
   </w:style>
   <w:style w:type="paragraph" w:styleId="2">
     <w:name w:val="heading 2"/>
-    <w:basedOn w:val="1"/>
-    <w:link w:val="16"/>
+    <w:basedOn w:val="a"/>
+    <w:link w:val="20"/>
+    <w:uiPriority w:val="9"/>
     <w:qFormat/>
-    <w:uiPriority w:val="9"/>
     <w:pPr>
       <w:widowControl/>
       <w:spacing w:before="100" w:beforeAutospacing="1" w:after="100" w:afterAutospacing="1"/>
@@ -985,11 +2030,10 @@
   </w:style>
   <w:style w:type="paragraph" w:styleId="3">
     <w:name w:val="heading 3"/>
-    <w:basedOn w:val="1"/>
-    <w:next w:val="1"/>
-    <w:link w:val="17"/>
+    <w:basedOn w:val="a"/>
+    <w:next w:val="a"/>
+    <w:link w:val="30"/>
     <w:qFormat/>
-    <w:uiPriority w:val="0"/>
     <w:pPr>
       <w:keepNext/>
       <w:keepLines/>
@@ -1005,11 +2049,10 @@
   </w:style>
   <w:style w:type="paragraph" w:styleId="4">
     <w:name w:val="heading 4"/>
-    <w:basedOn w:val="1"/>
-    <w:next w:val="1"/>
-    <w:link w:val="18"/>
+    <w:basedOn w:val="a"/>
+    <w:next w:val="a"/>
+    <w:link w:val="40"/>
     <w:qFormat/>
-    <w:uiPriority w:val="0"/>
     <w:pPr>
       <w:keepNext/>
       <w:keepLines/>
@@ -1017,24 +2060,26 @@
       <w:outlineLvl w:val="3"/>
     </w:pPr>
     <w:rPr>
-      <w:rFonts w:ascii="等线 Light" w:hAnsi="等线 Light" w:eastAsia="等线 Light" w:cs="Times New Roman"/>
+      <w:rFonts w:ascii="DengXian Light" w:eastAsia="DengXian Light" w:hAnsi="DengXian Light"/>
       <w:b/>
       <w:bCs/>
       <w:sz w:val="28"/>
       <w:szCs w:val="28"/>
     </w:rPr>
   </w:style>
-  <w:style w:type="character" w:styleId="12" w:default="1">
+  <w:style w:type="character" w:default="1" w:styleId="a0">
     <w:name w:val="Default Paragraph Font"/>
+    <w:uiPriority w:val="1"/>
     <w:semiHidden/>
-    <w:uiPriority w:val="0"/>
+    <w:unhideWhenUsed/>
   </w:style>
-  <w:style w:type="table" w:styleId="10" w:default="1">
+  <w:style w:type="table" w:default="1" w:styleId="a1">
     <w:name w:val="Normal Table"/>
+    <w:uiPriority w:val="99"/>
     <w:semiHidden/>
-    <w:uiPriority w:val="0"/>
+    <w:unhideWhenUsed/>
     <w:tblPr>
-      <w:tblStyle w:val="10"/>
+      <w:tblInd w:w="0" w:type="dxa"/>
       <w:tblCellMar>
         <w:top w:w="0" w:type="dxa"/>
         <w:left w:w="108" w:type="dxa"/>
@@ -1043,21 +2088,25 @@
       </w:tblCellMar>
     </w:tblPr>
   </w:style>
-  <w:style w:type="paragraph" w:styleId="5">
+  <w:style w:type="numbering" w:default="1" w:styleId="a2">
+    <w:name w:val="No List"/>
+    <w:uiPriority w:val="99"/>
+    <w:semiHidden/>
+    <w:unhideWhenUsed/>
+  </w:style>
+  <w:style w:type="paragraph" w:styleId="a3">
     <w:name w:val="Balloon Text"/>
-    <w:basedOn w:val="1"/>
-    <w:link w:val="19"/>
-    <w:uiPriority w:val="0"/>
+    <w:basedOn w:val="a"/>
+    <w:link w:val="a4"/>
     <w:rPr>
       <w:sz w:val="18"/>
       <w:szCs w:val="18"/>
     </w:rPr>
   </w:style>
-  <w:style w:type="paragraph" w:styleId="6">
+  <w:style w:type="paragraph" w:styleId="a5">
     <w:name w:val="footer"/>
-    <w:basedOn w:val="1"/>
-    <w:link w:val="20"/>
-    <w:uiPriority w:val="0"/>
+    <w:basedOn w:val="a"/>
+    <w:link w:val="a6"/>
     <w:pPr>
       <w:tabs>
         <w:tab w:val="center" w:pos="4153"/>
@@ -1071,14 +2120,13 @@
       <w:szCs w:val="18"/>
     </w:rPr>
   </w:style>
-  <w:style w:type="paragraph" w:styleId="7">
+  <w:style w:type="paragraph" w:styleId="a7">
     <w:name w:val="header"/>
-    <w:basedOn w:val="1"/>
-    <w:link w:val="21"/>
-    <w:uiPriority w:val="0"/>
+    <w:basedOn w:val="a"/>
+    <w:link w:val="a8"/>
     <w:pPr>
       <w:pBdr>
-        <w:bottom w:val="single" w:color="auto" w:sz="6" w:space="1"/>
+        <w:bottom w:val="single" w:sz="6" w:space="1" w:color="auto"/>
       </w:pBdr>
       <w:tabs>
         <w:tab w:val="center" w:pos="4153"/>
@@ -1092,12 +2140,12 @@
       <w:szCs w:val="18"/>
     </w:rPr>
   </w:style>
-  <w:style w:type="paragraph" w:styleId="8">
+  <w:style w:type="paragraph" w:styleId="HTML">
     <w:name w:val="HTML Preformatted"/>
-    <w:basedOn w:val="1"/>
-    <w:link w:val="22"/>
+    <w:basedOn w:val="a"/>
+    <w:link w:val="HTML0"/>
+    <w:uiPriority w:val="99"/>
     <w:unhideWhenUsed/>
-    <w:uiPriority w:val="99"/>
     <w:pPr>
       <w:widowControl/>
       <w:tabs>
@@ -1126,11 +2174,11 @@
       <w:sz w:val="24"/>
     </w:rPr>
   </w:style>
-  <w:style w:type="paragraph" w:styleId="9">
+  <w:style w:type="paragraph" w:styleId="a9">
     <w:name w:val="Normal (Web)"/>
-    <w:basedOn w:val="1"/>
+    <w:basedOn w:val="a"/>
+    <w:uiPriority w:val="99"/>
     <w:unhideWhenUsed/>
-    <w:uiPriority w:val="99"/>
     <w:pPr>
       <w:widowControl/>
       <w:spacing w:before="100" w:beforeAutospacing="1" w:after="100" w:afterAutospacing="1"/>
@@ -1142,54 +2190,52 @@
       <w:sz w:val="24"/>
     </w:rPr>
   </w:style>
-  <w:style w:type="table" w:styleId="11">
+  <w:style w:type="table" w:styleId="aa">
     <w:name w:val="Table Grid"/>
-    <w:basedOn w:val="10"/>
-    <w:uiPriority w:val="0"/>
+    <w:basedOn w:val="a1"/>
     <w:pPr>
       <w:widowControl w:val="0"/>
       <w:jc w:val="both"/>
     </w:pPr>
     <w:tblPr>
-      <w:tblStyle w:val="10"/>
       <w:tblBorders>
-        <w:top w:val="single" w:color="auto" w:sz="4" w:space="0"/>
-        <w:left w:val="single" w:color="auto" w:sz="4" w:space="0"/>
-        <w:bottom w:val="single" w:color="auto" w:sz="4" w:space="0"/>
-        <w:right w:val="single" w:color="auto" w:sz="4" w:space="0"/>
-        <w:insideH w:val="single" w:color="auto" w:sz="4" w:space="0"/>
-        <w:insideV w:val="single" w:color="auto" w:sz="4" w:space="0"/>
+        <w:top w:val="single" w:sz="4" w:space="0" w:color="auto"/>
+        <w:left w:val="single" w:sz="4" w:space="0" w:color="auto"/>
+        <w:bottom w:val="single" w:sz="4" w:space="0" w:color="auto"/>
+        <w:right w:val="single" w:sz="4" w:space="0" w:color="auto"/>
+        <w:insideH w:val="single" w:sz="4" w:space="0" w:color="auto"/>
+        <w:insideV w:val="single" w:sz="4" w:space="0" w:color="auto"/>
       </w:tblBorders>
     </w:tblPr>
   </w:style>
-  <w:style w:type="character" w:styleId="13">
+  <w:style w:type="character" w:styleId="ab">
     <w:name w:val="Strong"/>
+    <w:uiPriority w:val="22"/>
     <w:qFormat/>
-    <w:uiPriority w:val="22"/>
     <w:rPr>
       <w:b/>
       <w:bCs/>
     </w:rPr>
   </w:style>
-  <w:style w:type="character" w:styleId="14">
+  <w:style w:type="character" w:styleId="ac">
     <w:name w:val="Emphasis"/>
+    <w:uiPriority w:val="20"/>
     <w:qFormat/>
-    <w:uiPriority w:val="20"/>
     <w:rPr>
       <w:i/>
       <w:iCs/>
     </w:rPr>
   </w:style>
-  <w:style w:type="character" w:styleId="15">
+  <w:style w:type="character" w:styleId="ad">
     <w:name w:val="Hyperlink"/>
+    <w:uiPriority w:val="99"/>
     <w:unhideWhenUsed/>
-    <w:uiPriority w:val="99"/>
     <w:rPr>
       <w:color w:val="0000FF"/>
       <w:u w:val="single"/>
     </w:rPr>
   </w:style>
-  <w:style w:type="character" w:styleId="16" w:customStyle="1">
+  <w:style w:type="character" w:customStyle="1" w:styleId="20">
     <w:name w:val="标题 2 字符"/>
     <w:link w:val="2"/>
     <w:uiPriority w:val="9"/>
@@ -1201,10 +2247,9 @@
       <w:szCs w:val="36"/>
     </w:rPr>
   </w:style>
-  <w:style w:type="character" w:styleId="17" w:customStyle="1">
+  <w:style w:type="character" w:customStyle="1" w:styleId="30">
     <w:name w:val="标题 3 字符"/>
     <w:link w:val="3"/>
-    <w:uiPriority w:val="0"/>
     <w:rPr>
       <w:b/>
       <w:bCs/>
@@ -1213,12 +2258,11 @@
       <w:szCs w:val="32"/>
     </w:rPr>
   </w:style>
-  <w:style w:type="character" w:styleId="18" w:customStyle="1">
+  <w:style w:type="character" w:customStyle="1" w:styleId="40">
     <w:name w:val="标题 4 字符"/>
     <w:link w:val="4"/>
-    <w:uiPriority w:val="0"/>
     <w:rPr>
-      <w:rFonts w:ascii="等线 Light" w:hAnsi="等线 Light" w:eastAsia="等线 Light" w:cs="Times New Roman"/>
+      <w:rFonts w:ascii="DengXian Light" w:eastAsia="DengXian Light" w:hAnsi="DengXian Light" w:cs="Times New Roman"/>
       <w:b/>
       <w:bCs/>
       <w:kern w:val="2"/>
@@ -1226,39 +2270,36 @@
       <w:szCs w:val="28"/>
     </w:rPr>
   </w:style>
-  <w:style w:type="character" w:styleId="19" w:customStyle="1">
+  <w:style w:type="character" w:customStyle="1" w:styleId="a4">
     <w:name w:val="批注框文本 字符"/>
-    <w:link w:val="5"/>
-    <w:uiPriority w:val="0"/>
+    <w:link w:val="a3"/>
     <w:rPr>
       <w:kern w:val="2"/>
       <w:sz w:val="18"/>
       <w:szCs w:val="18"/>
     </w:rPr>
   </w:style>
-  <w:style w:type="character" w:styleId="20" w:customStyle="1">
+  <w:style w:type="character" w:customStyle="1" w:styleId="a6">
     <w:name w:val="页脚 字符"/>
-    <w:link w:val="6"/>
-    <w:uiPriority w:val="0"/>
+    <w:link w:val="a5"/>
     <w:rPr>
       <w:kern w:val="2"/>
       <w:sz w:val="18"/>
       <w:szCs w:val="18"/>
     </w:rPr>
   </w:style>
-  <w:style w:type="character" w:styleId="21" w:customStyle="1">
+  <w:style w:type="character" w:customStyle="1" w:styleId="a8">
     <w:name w:val="页眉 字符"/>
-    <w:link w:val="7"/>
-    <w:uiPriority w:val="0"/>
+    <w:link w:val="a7"/>
     <w:rPr>
       <w:kern w:val="2"/>
       <w:sz w:val="18"/>
       <w:szCs w:val="18"/>
     </w:rPr>
   </w:style>
-  <w:style w:type="character" w:styleId="22" w:customStyle="1">
+  <w:style w:type="character" w:customStyle="1" w:styleId="HTML0">
     <w:name w:val="HTML 预设格式 字符"/>
-    <w:link w:val="8"/>
+    <w:link w:val="HTML"/>
     <w:uiPriority w:val="99"/>
     <w:rPr>
       <w:rFonts w:ascii="宋体" w:hAnsi="宋体" w:cs="宋体"/>
@@ -1266,13 +2307,13 @@
       <w:szCs w:val="24"/>
     </w:rPr>
   </w:style>
-  <w:style w:type="paragraph" w:styleId="23">
+  <w:style w:type="paragraph" w:styleId="ae">
     <w:name w:val="List Paragraph"/>
-    <w:basedOn w:val="1"/>
+    <w:basedOn w:val="a"/>
+    <w:uiPriority w:val="99"/>
     <w:qFormat/>
-    <w:uiPriority w:val="99"/>
     <w:pPr>
-      <w:ind w:firstLine="420" w:firstLineChars="200"/>
+      <w:ind w:firstLineChars="200" w:firstLine="420"/>
     </w:pPr>
   </w:style>
 </w:styles>
@@ -1559,5 +2600,6 @@
     </a:fmtScheme>
   </a:themeElements>
   <a:objectDefaults/>
+  <a:extraClrSchemeLst/>
 </a:theme>
 </file>
</xml_diff>